<commit_message>
fixed issues in expenses table
</commit_message>
<xml_diff>
--- a/packages/mock-data/src/tables/expenses/SQLValley_Expenses_README.docx
+++ b/packages/mock-data/src/tables/expenses/SQLValley_Expenses_README.docx
@@ -5,21 +5,17 @@
     <w:p>
       <w:pPr>
         <w:pStyle w:val="Title"/>
-        <w:jc w:val="center"/>
       </w:pPr>
       <w:r>
-        <w:t>SQLValley Expenses Table - README</w:t>
+        <w:t>SQLValley Expenses — README</w:t>
       </w:r>
     </w:p>
     <w:p>
-      <w:pPr>
-        <w:jc w:val="center"/>
-      </w:pPr>
       <w:r>
         <w:rPr>
           <w:b/>
         </w:rPr>
-        <w:t>Baseline generated datasets: sqlvalley_expenses.csv + sqlvalley_expenses_with_helpers.csv</w:t>
+        <w:t>Historically aligned neutral baseline • January 2023–April 2025</w:t>
       </w:r>
     </w:p>
     <w:p>
@@ -27,12 +23,26 @@
         <w:pStyle w:val="Heading1"/>
       </w:pPr>
       <w:r>
-        <w:t>1. Purpose</w:t>
+        <w:t>1. Table purpose</w:t>
       </w:r>
     </w:p>
     <w:p>
       <w:r>
-        <w:t>The expenses table records HeriShare non-payroll operating expenditure. It is designed as an indirect financial diary: spending volume, department mix, amounts, requester/approver patterns, and description quality change as the company grows, enters crisis, shuts down, pivots, and recovers. Payroll and salary changes remain in contracts and are not duplicated here.</w:t>
+        <w:t>The expenses table records non-payroll operating expenditure. The data is designed to reflect HeriShare's changing scale, organization and business model through ordinary spending patterns rather than explicit storyline labels.</w:t>
+      </w:r>
+    </w:p>
+    <w:p>
+      <w:r>
+        <w:rPr>
+          <w:rFonts w:ascii="Consolas" w:hAnsi="Consolas"/>
+          <w:sz w:val="17"/>
+        </w:rPr>
+        <w:t>expenses(exp_id, amount, d_id, description, date, requested_by, approved_by)</w:t>
+      </w:r>
+    </w:p>
+    <w:p>
+      <w:r>
+        <w:t>The regenerated baseline contains 1,708 expense rows. Salaries remain in contracts and are not duplicated here.</w:t>
       </w:r>
     </w:p>
     <w:p>
@@ -40,7 +50,531 @@
         <w:pStyle w:val="Heading1"/>
       </w:pPr>
       <w:r>
-        <w:t>2. Schema</w:t>
+        <w:t>2. Historical alignment rules</w:t>
+      </w:r>
+    </w:p>
+    <w:p>
+      <w:pPr>
+        <w:ind w:left="230" w:hanging="173"/>
+      </w:pPr>
+      <w:r>
+        <w:rPr>
+          <w:b/>
+        </w:rPr>
+        <w:t xml:space="preserve">• </w:t>
+      </w:r>
+      <w:r>
+        <w:t>Before 23 June 2023, HeriShare has no formal departments or employees. d_id, requested_by and approved_by are therefore NULL for founder-era expenses.</w:t>
+      </w:r>
+    </w:p>
+    <w:p>
+      <w:pPr>
+        <w:ind w:left="230" w:hanging="173"/>
+      </w:pPr>
+      <w:r>
+        <w:rPr>
+          <w:b/>
+        </w:rPr>
+        <w:t xml:space="preserve">• </w:t>
+      </w:r>
+      <w:r>
+        <w:t>Department IDs appear only after the department exists in the canonical 14-department timeline.</w:t>
+      </w:r>
+    </w:p>
+    <w:p>
+      <w:pPr>
+        <w:ind w:left="230" w:hanging="173"/>
+      </w:pPr>
+      <w:r>
+        <w:rPr>
+          <w:b/>
+        </w:rPr>
+        <w:t xml:space="preserve">• </w:t>
+      </w:r>
+      <w:r>
+        <w:t>Requesters and approvers use exact 8-digit employee IDs from the current employees dataset and cannot appear before hire or after employment ends.</w:t>
+      </w:r>
+    </w:p>
+    <w:p>
+      <w:pPr>
+        <w:ind w:left="230" w:hanging="173"/>
+      </w:pPr>
+      <w:r>
+        <w:rPr>
+          <w:b/>
+        </w:rPr>
+        <w:t xml:space="preserve">• </w:t>
+      </w:r>
+      <w:r>
+        <w:t>PTO, sick leave, parental leave and sabbatical periods are excluded from employee availability for generated requests/approvals.</w:t>
+      </w:r>
+    </w:p>
+    <w:p>
+      <w:pPr>
+        <w:ind w:left="230" w:hanging="173"/>
+      </w:pPr>
+      <w:r>
+        <w:rPr>
+          <w:b/>
+        </w:rPr>
+        <w:t xml:space="preserve">• </w:t>
+      </w:r>
+      <w:r>
+        <w:t>Current allocations are mapped back to the 14 canonical department IDs, with historical overrides for known transfers and temporary founder oversight.</w:t>
+      </w:r>
+    </w:p>
+    <w:p>
+      <w:pPr>
+        <w:ind w:left="230" w:hanging="173"/>
+      </w:pPr>
+      <w:r>
+        <w:rPr>
+          <w:b/>
+        </w:rPr>
+        <w:t xml:space="preserve">• </w:t>
+      </w:r>
+      <w:r>
+        <w:t>No self-approved expenses are generated.</w:t>
+      </w:r>
+    </w:p>
+    <w:p>
+      <w:pPr>
+        <w:ind w:left="230" w:hanging="173"/>
+      </w:pPr>
+      <w:r>
+        <w:rPr>
+          <w:b/>
+        </w:rPr>
+        <w:t xml:space="preserve">• </w:t>
+      </w:r>
+      <w:r>
+        <w:t>The baseline contains no deliberate fraud, threshold avoidance, duplicate-invoice scheme or exercise-specific anomaly.</w:t>
+      </w:r>
+    </w:p>
+    <w:p>
+      <w:pPr>
+        <w:pStyle w:val="Heading1"/>
+      </w:pPr>
+      <w:r>
+        <w:t>3. Department activation</w:t>
+      </w:r>
+    </w:p>
+    <w:tbl>
+      <w:tblPr>
+        <w:tblStyle w:val="TableGrid"/>
+        <w:tblW w:type="auto" w:w="0"/>
+        <w:jc w:val="center"/>
+        <w:tblLook w:firstColumn="1" w:firstRow="1" w:lastColumn="0" w:lastRow="0" w:noHBand="0" w:noVBand="1" w:val="04A0"/>
+      </w:tblPr>
+      <w:tblGrid>
+        <w:gridCol w:w="3456"/>
+        <w:gridCol w:w="3456"/>
+        <w:gridCol w:w="3456"/>
+      </w:tblGrid>
+      <w:tr>
+        <w:trPr>
+          <w:cantSplit/>
+        </w:trPr>
+        <w:tc>
+          <w:tcPr>
+            <w:tcW w:type="dxa" w:w="3456"/>
+            <w:vAlign w:val="center"/>
+          </w:tcPr>
+          <w:p>
+            <w:pPr>
+              <w:spacing w:before="0" w:after="0"/>
+            </w:pPr>
+            <w:r>
+              <w:rPr>
+                <w:sz w:val="16"/>
+              </w:rPr>
+              <w:t>Date</w:t>
+            </w:r>
+          </w:p>
+        </w:tc>
+        <w:tc>
+          <w:tcPr>
+            <w:tcW w:type="dxa" w:w="3456"/>
+            <w:vAlign w:val="center"/>
+          </w:tcPr>
+          <w:p>
+            <w:pPr>
+              <w:spacing w:before="0" w:after="0"/>
+            </w:pPr>
+            <w:r>
+              <w:rPr>
+                <w:sz w:val="16"/>
+              </w:rPr>
+              <w:t>New valid d_id values</w:t>
+            </w:r>
+          </w:p>
+        </w:tc>
+        <w:tc>
+          <w:tcPr>
+            <w:tcW w:type="dxa" w:w="3456"/>
+            <w:vAlign w:val="center"/>
+          </w:tcPr>
+          <w:p>
+            <w:pPr>
+              <w:spacing w:before="0" w:after="0"/>
+            </w:pPr>
+            <w:r>
+              <w:rPr>
+                <w:sz w:val="16"/>
+              </w:rPr>
+              <w:t>Meaning</w:t>
+            </w:r>
+          </w:p>
+        </w:tc>
+      </w:tr>
+      <w:tr>
+        <w:trPr>
+          <w:cantSplit/>
+        </w:trPr>
+        <w:tc>
+          <w:tcPr>
+            <w:tcW w:type="dxa" w:w="3456"/>
+            <w:vAlign w:val="center"/>
+          </w:tcPr>
+          <w:p>
+            <w:pPr>
+              <w:spacing w:before="0" w:after="0"/>
+            </w:pPr>
+            <w:r>
+              <w:rPr>
+                <w:sz w:val="16"/>
+              </w:rPr>
+              <w:t>Before 23 Jun 2023</w:t>
+            </w:r>
+          </w:p>
+        </w:tc>
+        <w:tc>
+          <w:tcPr>
+            <w:tcW w:type="dxa" w:w="3456"/>
+            <w:vAlign w:val="center"/>
+          </w:tcPr>
+          <w:p>
+            <w:pPr>
+              <w:spacing w:before="0" w:after="0"/>
+            </w:pPr>
+            <w:r>
+              <w:rPr>
+                <w:sz w:val="16"/>
+              </w:rPr>
+              <w:t>None</w:t>
+            </w:r>
+          </w:p>
+        </w:tc>
+        <w:tc>
+          <w:tcPr>
+            <w:tcW w:type="dxa" w:w="3456"/>
+            <w:vAlign w:val="center"/>
+          </w:tcPr>
+          <w:p>
+            <w:pPr>
+              <w:spacing w:before="0" w:after="0"/>
+            </w:pPr>
+            <w:r>
+              <w:rPr>
+                <w:sz w:val="16"/>
+              </w:rPr>
+              <w:t>Founder expenses only; all FK fields NULL</w:t>
+            </w:r>
+          </w:p>
+        </w:tc>
+      </w:tr>
+      <w:tr>
+        <w:trPr>
+          <w:cantSplit/>
+        </w:trPr>
+        <w:tc>
+          <w:tcPr>
+            <w:tcW w:type="dxa" w:w="3456"/>
+            <w:vAlign w:val="center"/>
+          </w:tcPr>
+          <w:p>
+            <w:pPr>
+              <w:spacing w:before="0" w:after="0"/>
+            </w:pPr>
+            <w:r>
+              <w:rPr>
+                <w:sz w:val="16"/>
+              </w:rPr>
+              <w:t>23 Jun 2023</w:t>
+            </w:r>
+          </w:p>
+        </w:tc>
+        <w:tc>
+          <w:tcPr>
+            <w:tcW w:type="dxa" w:w="3456"/>
+            <w:vAlign w:val="center"/>
+          </w:tcPr>
+          <w:p>
+            <w:pPr>
+              <w:spacing w:before="0" w:after="0"/>
+            </w:pPr>
+            <w:r>
+              <w:rPr>
+                <w:sz w:val="16"/>
+              </w:rPr>
+              <w:t>1000, 2100</w:t>
+            </w:r>
+          </w:p>
+        </w:tc>
+        <w:tc>
+          <w:tcPr>
+            <w:tcW w:type="dxa" w:w="3456"/>
+            <w:vAlign w:val="center"/>
+          </w:tcPr>
+          <w:p>
+            <w:pPr>
+              <w:spacing w:before="0" w:after="0"/>
+            </w:pPr>
+            <w:r>
+              <w:rPr>
+                <w:sz w:val="16"/>
+              </w:rPr>
+              <w:t>Executive; Product and Software Engineering</w:t>
+            </w:r>
+          </w:p>
+        </w:tc>
+      </w:tr>
+      <w:tr>
+        <w:trPr>
+          <w:cantSplit/>
+        </w:trPr>
+        <w:tc>
+          <w:tcPr>
+            <w:tcW w:type="dxa" w:w="3456"/>
+            <w:vAlign w:val="center"/>
+          </w:tcPr>
+          <w:p>
+            <w:pPr>
+              <w:spacing w:before="0" w:after="0"/>
+            </w:pPr>
+            <w:r>
+              <w:rPr>
+                <w:sz w:val="16"/>
+              </w:rPr>
+              <w:t>3 Jul 2023</w:t>
+            </w:r>
+          </w:p>
+        </w:tc>
+        <w:tc>
+          <w:tcPr>
+            <w:tcW w:type="dxa" w:w="3456"/>
+            <w:vAlign w:val="center"/>
+          </w:tcPr>
+          <w:p>
+            <w:pPr>
+              <w:spacing w:before="0" w:after="0"/>
+            </w:pPr>
+            <w:r>
+              <w:rPr>
+                <w:sz w:val="16"/>
+              </w:rPr>
+              <w:t>+ 7100</w:t>
+            </w:r>
+          </w:p>
+        </w:tc>
+        <w:tc>
+          <w:tcPr>
+            <w:tcW w:type="dxa" w:w="3456"/>
+            <w:vAlign w:val="center"/>
+          </w:tcPr>
+          <w:p>
+            <w:pPr>
+              <w:spacing w:before="0" w:after="0"/>
+            </w:pPr>
+            <w:r>
+              <w:rPr>
+                <w:sz w:val="16"/>
+              </w:rPr>
+              <w:t>Client Services</w:t>
+            </w:r>
+          </w:p>
+        </w:tc>
+      </w:tr>
+      <w:tr>
+        <w:trPr>
+          <w:cantSplit/>
+        </w:trPr>
+        <w:tc>
+          <w:tcPr>
+            <w:tcW w:type="dxa" w:w="3456"/>
+            <w:vAlign w:val="center"/>
+          </w:tcPr>
+          <w:p>
+            <w:pPr>
+              <w:spacing w:before="0" w:after="0"/>
+            </w:pPr>
+            <w:r>
+              <w:rPr>
+                <w:sz w:val="16"/>
+              </w:rPr>
+              <w:t>25 Aug 2023</w:t>
+            </w:r>
+          </w:p>
+        </w:tc>
+        <w:tc>
+          <w:tcPr>
+            <w:tcW w:type="dxa" w:w="3456"/>
+            <w:vAlign w:val="center"/>
+          </w:tcPr>
+          <w:p>
+            <w:pPr>
+              <w:spacing w:before="0" w:after="0"/>
+            </w:pPr>
+            <w:r>
+              <w:rPr>
+                <w:sz w:val="16"/>
+              </w:rPr>
+              <w:t>+ 3100, 4100</w:t>
+            </w:r>
+          </w:p>
+        </w:tc>
+        <w:tc>
+          <w:tcPr>
+            <w:tcW w:type="dxa" w:w="3456"/>
+            <w:vAlign w:val="center"/>
+          </w:tcPr>
+          <w:p>
+            <w:pPr>
+              <w:spacing w:before="0" w:after="0"/>
+            </w:pPr>
+            <w:r>
+              <w:rPr>
+                <w:sz w:val="16"/>
+              </w:rPr>
+              <w:t>Institutional Partnerships; Asset Operations</w:t>
+            </w:r>
+          </w:p>
+        </w:tc>
+      </w:tr>
+      <w:tr>
+        <w:trPr>
+          <w:cantSplit/>
+        </w:trPr>
+        <w:tc>
+          <w:tcPr>
+            <w:tcW w:type="dxa" w:w="3456"/>
+            <w:vAlign w:val="center"/>
+          </w:tcPr>
+          <w:p>
+            <w:pPr>
+              <w:spacing w:before="0" w:after="0"/>
+            </w:pPr>
+            <w:r>
+              <w:rPr>
+                <w:sz w:val="16"/>
+              </w:rPr>
+              <w:t>5 Oct 2023</w:t>
+            </w:r>
+          </w:p>
+        </w:tc>
+        <w:tc>
+          <w:tcPr>
+            <w:tcW w:type="dxa" w:w="3456"/>
+            <w:vAlign w:val="center"/>
+          </w:tcPr>
+          <w:p>
+            <w:pPr>
+              <w:spacing w:before="0" w:after="0"/>
+            </w:pPr>
+            <w:r>
+              <w:rPr>
+                <w:sz w:val="16"/>
+              </w:rPr>
+              <w:t>+ 2300, 4200, 6100</w:t>
+            </w:r>
+          </w:p>
+        </w:tc>
+        <w:tc>
+          <w:tcPr>
+            <w:tcW w:type="dxa" w:w="3456"/>
+            <w:vAlign w:val="center"/>
+          </w:tcPr>
+          <w:p>
+            <w:pPr>
+              <w:spacing w:before="0" w:after="0"/>
+            </w:pPr>
+            <w:r>
+              <w:rPr>
+                <w:sz w:val="16"/>
+              </w:rPr>
+              <w:t>Infrastructure/Security; Logistics/Custody; Finance/Transaction Ops</w:t>
+            </w:r>
+          </w:p>
+        </w:tc>
+      </w:tr>
+      <w:tr>
+        <w:trPr>
+          <w:cantSplit/>
+        </w:trPr>
+        <w:tc>
+          <w:tcPr>
+            <w:tcW w:type="dxa" w:w="3456"/>
+            <w:vAlign w:val="center"/>
+          </w:tcPr>
+          <w:p>
+            <w:pPr>
+              <w:spacing w:before="0" w:after="0"/>
+            </w:pPr>
+            <w:r>
+              <w:rPr>
+                <w:sz w:val="16"/>
+              </w:rPr>
+              <w:t>19 Nov 2023</w:t>
+            </w:r>
+          </w:p>
+        </w:tc>
+        <w:tc>
+          <w:tcPr>
+            <w:tcW w:type="dxa" w:w="3456"/>
+            <w:vAlign w:val="center"/>
+          </w:tcPr>
+          <w:p>
+            <w:pPr>
+              <w:spacing w:before="0" w:after="0"/>
+            </w:pPr>
+            <w:r>
+              <w:rPr>
+                <w:sz w:val="16"/>
+              </w:rPr>
+              <w:t>+ 2200, 3200, 5100, 5200, 6200, 7200</w:t>
+            </w:r>
+          </w:p>
+        </w:tc>
+        <w:tc>
+          <w:tcPr>
+            <w:tcW w:type="dxa" w:w="3456"/>
+            <w:vAlign w:val="center"/>
+          </w:tcPr>
+          <w:p>
+            <w:pPr>
+              <w:spacing w:before="0" w:after="0"/>
+            </w:pPr>
+            <w:r>
+              <w:rPr>
+                <w:sz w:val="16"/>
+              </w:rPr>
+              <w:t>Full 14-department structure</w:t>
+            </w:r>
+          </w:p>
+        </w:tc>
+      </w:tr>
+    </w:tbl>
+    <w:p>
+      <w:r>
+        <w:t>Historical renames preserve d_id: 4100 Asset Operations → Asset Research and Onboarding (5 Oct 2023); 3100 Institutional Partnerships → Seller Partnerships (25 Aug 2024); 3200 Investor and Buyer Relations → Private Sales and Buyer Relations (25 Aug 2024); 5200 Compliance and Trust → Compliance and Investigations (25 Aug 2024).</w:t>
+      </w:r>
+    </w:p>
+    <w:p>
+      <w:pPr>
+        <w:pStyle w:val="Heading1"/>
+      </w:pPr>
+      <w:r>
+        <w:t>4. Business-state behavior</w:t>
       </w:r>
     </w:p>
     <w:tbl>
@@ -56,245 +590,296 @@
       </w:tblGrid>
       <w:tr>
         <w:trPr>
-          <w:tblHeader w:val="true"/>
+          <w:cantSplit/>
         </w:trPr>
         <w:tc>
           <w:tcPr>
-            <w:tcW w:type="dxa" w:w="2016"/>
-            <w:shd w:fill="D9EAF7"/>
+            <w:tcW w:type="dxa" w:w="5184"/>
           </w:tcPr>
           <w:p>
+            <w:pPr>
+              <w:spacing w:before="0" w:after="0"/>
+            </w:pPr>
             <w:r>
               <w:rPr>
-                <w:b/>
                 <w:sz w:val="16"/>
               </w:rPr>
-              <w:t>Column</w:t>
+              <w:t>Period</w:t>
             </w:r>
           </w:p>
         </w:tc>
         <w:tc>
           <w:tcPr>
-            <w:tcW w:type="dxa" w:w="9504"/>
-            <w:shd w:fill="D9EAF7"/>
+            <w:tcW w:type="dxa" w:w="5184"/>
           </w:tcPr>
           <w:p>
+            <w:pPr>
+              <w:spacing w:before="0" w:after="0"/>
+            </w:pPr>
             <w:r>
               <w:rPr>
-                <w:b/>
                 <w:sz w:val="16"/>
               </w:rPr>
-              <w:t>Meaning</w:t>
+              <w:t>Expense character</w:t>
             </w:r>
           </w:p>
         </w:tc>
       </w:tr>
       <w:tr>
+        <w:trPr>
+          <w:cantSplit/>
+        </w:trPr>
         <w:tc>
           <w:tcPr>
-            <w:tcW w:type="dxa" w:w="2016"/>
-            <w:vAlign w:val="center"/>
+            <w:tcW w:type="dxa" w:w="5184"/>
           </w:tcPr>
           <w:p>
+            <w:pPr>
+              <w:spacing w:before="0" w:after="0"/>
+            </w:pPr>
             <w:r>
               <w:rPr>
                 <w:sz w:val="16"/>
               </w:rPr>
-              <w:t>exp_id</w:t>
+              <w:t>Jan–22 Jun 2023</w:t>
             </w:r>
           </w:p>
         </w:tc>
         <w:tc>
           <w:tcPr>
-            <w:tcW w:type="dxa" w:w="9504"/>
-            <w:vAlign w:val="center"/>
+            <w:tcW w:type="dxa" w:w="5184"/>
           </w:tcPr>
           <w:p>
+            <w:pPr>
+              <w:spacing w:before="0" w:after="0"/>
+            </w:pPr>
             <w:r>
               <w:rPr>
                 <w:sz w:val="16"/>
               </w:rPr>
-              <w:t>Primary key for the expense record.</w:t>
+              <w:t>Sparse founder purchases; casual descriptions; no department or approval structure.</w:t>
             </w:r>
           </w:p>
         </w:tc>
       </w:tr>
       <w:tr>
+        <w:trPr>
+          <w:cantSplit/>
+        </w:trPr>
         <w:tc>
           <w:tcPr>
-            <w:tcW w:type="dxa" w:w="2016"/>
-            <w:vAlign w:val="center"/>
+            <w:tcW w:type="dxa" w:w="5184"/>
           </w:tcPr>
           <w:p>
+            <w:pPr>
+              <w:spacing w:before="0" w:after="0"/>
+            </w:pPr>
             <w:r>
               <w:rPr>
                 <w:sz w:val="16"/>
               </w:rPr>
-              <w:t>amount</w:t>
+              <w:t>23 Jun–18 Nov 2023</w:t>
             </w:r>
           </w:p>
         </w:tc>
         <w:tc>
           <w:tcPr>
-            <w:tcW w:type="dxa" w:w="9504"/>
-            <w:vAlign w:val="center"/>
+            <w:tcW w:type="dxa" w:w="5184"/>
           </w:tcPr>
           <w:p>
+            <w:pPr>
+              <w:spacing w:before="0" w:after="0"/>
+            </w:pPr>
             <w:r>
               <w:rPr>
                 <w:sz w:val="16"/>
               </w:rPr>
-              <w:t>Expense amount in USD.</w:t>
+              <w:t>Formal organization develops gradually. Costs move into departments only as those teams are created.</w:t>
             </w:r>
           </w:p>
         </w:tc>
       </w:tr>
       <w:tr>
+        <w:trPr>
+          <w:cantSplit/>
+        </w:trPr>
         <w:tc>
           <w:tcPr>
-            <w:tcW w:type="dxa" w:w="2016"/>
-            <w:vAlign w:val="center"/>
+            <w:tcW w:type="dxa" w:w="5184"/>
           </w:tcPr>
           <w:p>
+            <w:pPr>
+              <w:spacing w:before="0" w:after="0"/>
+            </w:pPr>
             <w:r>
               <w:rPr>
                 <w:sz w:val="16"/>
               </w:rPr>
-              <w:t>d_id</w:t>
+              <w:t>19 Nov 2023–10 May 2024</w:t>
             </w:r>
           </w:p>
         </w:tc>
         <w:tc>
           <w:tcPr>
-            <w:tcW w:type="dxa" w:w="9504"/>
-            <w:vAlign w:val="center"/>
+            <w:tcW w:type="dxa" w:w="5184"/>
           </w:tcPr>
           <w:p>
+            <w:pPr>
+              <w:spacing w:before="0" w:after="0"/>
+            </w:pPr>
             <w:r>
               <w:rPr>
                 <w:sz w:val="16"/>
               </w:rPr>
-              <w:t>Department charged for the expense; FK to departments(d_id).</w:t>
+              <w:t>Full department structure, rapid hiring, professional descriptions and broad recurring operating spend.</w:t>
             </w:r>
           </w:p>
         </w:tc>
       </w:tr>
       <w:tr>
+        <w:trPr>
+          <w:cantSplit/>
+        </w:trPr>
         <w:tc>
           <w:tcPr>
-            <w:tcW w:type="dxa" w:w="2016"/>
-            <w:vAlign w:val="center"/>
+            <w:tcW w:type="dxa" w:w="5184"/>
           </w:tcPr>
           <w:p>
+            <w:pPr>
+              <w:spacing w:before="0" w:after="0"/>
+            </w:pPr>
             <w:r>
               <w:rPr>
                 <w:sz w:val="16"/>
               </w:rPr>
-              <w:t>description</w:t>
+              <w:t>11 May–8 Jun 2024</w:t>
             </w:r>
           </w:p>
         </w:tc>
         <w:tc>
           <w:tcPr>
-            <w:tcW w:type="dxa" w:w="9504"/>
-            <w:vAlign w:val="center"/>
+            <w:tcW w:type="dxa" w:w="5184"/>
           </w:tcPr>
           <w:p>
+            <w:pPr>
+              <w:spacing w:before="0" w:after="0"/>
+            </w:pPr>
             <w:r>
               <w:rPr>
                 <w:sz w:val="16"/>
               </w:rPr>
-              <w:t>Human-entered description of the expense.</w:t>
+              <w:t>Spending shifts toward Legal, Compliance, Client Services and Communications while recruitment/expansion slows.</w:t>
             </w:r>
           </w:p>
         </w:tc>
       </w:tr>
       <w:tr>
+        <w:trPr>
+          <w:cantSplit/>
+        </w:trPr>
         <w:tc>
           <w:tcPr>
-            <w:tcW w:type="dxa" w:w="2016"/>
-            <w:vAlign w:val="center"/>
+            <w:tcW w:type="dxa" w:w="5184"/>
           </w:tcPr>
           <w:p>
+            <w:pPr>
+              <w:spacing w:before="0" w:after="0"/>
+            </w:pPr>
             <w:r>
               <w:rPr>
                 <w:sz w:val="16"/>
               </w:rPr>
-              <w:t>date</w:t>
+              <w:t>9 Jun–24 Aug 2024</w:t>
             </w:r>
           </w:p>
         </w:tc>
         <w:tc>
           <w:tcPr>
-            <w:tcW w:type="dxa" w:w="9504"/>
-            <w:vAlign w:val="center"/>
+            <w:tcW w:type="dxa" w:w="5184"/>
           </w:tcPr>
           <w:p>
+            <w:pPr>
+              <w:spacing w:before="0" w:after="0"/>
+            </w:pPr>
             <w:r>
               <w:rPr>
                 <w:sz w:val="16"/>
               </w:rPr>
-              <w:t>Expense date in YYYY-MM-DD format.</w:t>
+              <w:t>Sharp contraction after shutdown. Essential legal, custody, insurance, security and accounting costs remain.</w:t>
             </w:r>
           </w:p>
         </w:tc>
       </w:tr>
       <w:tr>
+        <w:trPr>
+          <w:cantSplit/>
+        </w:trPr>
         <w:tc>
           <w:tcPr>
-            <w:tcW w:type="dxa" w:w="2016"/>
-            <w:vAlign w:val="center"/>
+            <w:tcW w:type="dxa" w:w="5184"/>
           </w:tcPr>
           <w:p>
+            <w:pPr>
+              <w:spacing w:before="0" w:after="0"/>
+            </w:pPr>
             <w:r>
               <w:rPr>
                 <w:sz w:val="16"/>
               </w:rPr>
-              <w:t>requested_by</w:t>
+              <w:t>25 Aug–28 Sep 2024</w:t>
             </w:r>
           </w:p>
         </w:tc>
         <w:tc>
           <w:tcPr>
-            <w:tcW w:type="dxa" w:w="9504"/>
-            <w:vAlign w:val="center"/>
+            <w:tcW w:type="dxa" w:w="5184"/>
           </w:tcPr>
           <w:p>
+            <w:pPr>
+              <w:spacing w:before="0" w:after="0"/>
+            </w:pPr>
             <w:r>
               <w:rPr>
                 <w:sz w:val="16"/>
               </w:rPr>
-              <w:t>Employee who requested the expense; FK to employees(e_id), or NULL for backfilled/legacy records.</w:t>
+              <w:t>Selective restructuring spend: systems, data, legal, compliance and marketplace preparation.</w:t>
             </w:r>
           </w:p>
         </w:tc>
       </w:tr>
       <w:tr>
+        <w:trPr>
+          <w:cantSplit/>
+        </w:trPr>
         <w:tc>
           <w:tcPr>
-            <w:tcW w:type="dxa" w:w="2016"/>
-            <w:vAlign w:val="center"/>
+            <w:tcW w:type="dxa" w:w="5184"/>
           </w:tcPr>
           <w:p>
+            <w:pPr>
+              <w:spacing w:before="0" w:after="0"/>
+            </w:pPr>
             <w:r>
               <w:rPr>
                 <w:sz w:val="16"/>
               </w:rPr>
-              <w:t>approved_by</w:t>
+              <w:t>29 Sep 2024–Apr 2025</w:t>
             </w:r>
           </w:p>
         </w:tc>
         <w:tc>
           <w:tcPr>
-            <w:tcW w:type="dxa" w:w="9504"/>
-            <w:vAlign w:val="center"/>
+            <w:tcW w:type="dxa" w:w="5184"/>
           </w:tcPr>
           <w:p>
+            <w:pPr>
+              <w:spacing w:before="0" w:after="0"/>
+            </w:pPr>
             <w:r>
               <w:rPr>
                 <w:sz w:val="16"/>
               </w:rPr>
-              <w:t>Employee who approved the expense; FK to employees(e_id), or NULL where no formal approval record exists.</w:t>
+              <w:t>Private-marketplace recovery: seller/buyer operations, provenance, KYC, secure shipping, custody and transaction operations grow.</w:t>
             </w:r>
           </w:p>
         </w:tc>
@@ -305,7 +890,20 @@
         <w:pStyle w:val="Heading1"/>
       </w:pPr>
       <w:r>
-        <w:t>3. Dataset snapshot</w:t>
+        <w:t>5. Description style</w:t>
+      </w:r>
+    </w:p>
+    <w:p>
+      <w:r>
+        <w:t>Descriptions intentionally become more professional over time. Early rows include entries such as “hosting”, “figma monthly” and “boxes for Northbridge”. Mature rows use language such as “Cloud infrastructure”, “Asset condition assessment” and “External accounting services”. Crisis-period descriptions stay professional but shift toward ownership review, investigation, complaint handling and essential continuity. Post-pivot descriptions use private-market language such as “Seller provenance review”, “Private client travel” and “Secure custody services”.</w:t>
+      </w:r>
+    </w:p>
+    <w:p>
+      <w:pPr>
+        <w:pStyle w:val="Heading1"/>
+      </w:pPr>
+      <w:r>
+        <w:t>6. Generated volume</w:t>
       </w:r>
     </w:p>
     <w:tbl>
@@ -316,54 +914,40 @@
         <w:tblLook w:firstColumn="1" w:firstRow="1" w:lastColumn="0" w:lastRow="0" w:noHBand="0" w:noVBand="1" w:val="04A0"/>
       </w:tblPr>
       <w:tblGrid>
-        <w:gridCol w:w="2592"/>
-        <w:gridCol w:w="2592"/>
-        <w:gridCol w:w="2592"/>
-        <w:gridCol w:w="2592"/>
+        <w:gridCol w:w="3456"/>
+        <w:gridCol w:w="3456"/>
+        <w:gridCol w:w="3456"/>
       </w:tblGrid>
       <w:tr>
         <w:trPr>
-          <w:tblHeader w:val="true"/>
+          <w:cantSplit/>
         </w:trPr>
         <w:tc>
           <w:tcPr>
-            <w:tcW w:type="dxa" w:w="1440"/>
-            <w:shd w:fill="D9EAF7"/>
+            <w:tcW w:type="dxa" w:w="3456"/>
           </w:tcPr>
           <w:p>
+            <w:pPr>
+              <w:spacing w:before="0" w:after="0"/>
+            </w:pPr>
             <w:r>
               <w:rPr>
-                <w:b/>
                 <w:sz w:val="16"/>
               </w:rPr>
-              <w:t>Period</w:t>
+              <w:t>Month</w:t>
             </w:r>
           </w:p>
         </w:tc>
         <w:tc>
           <w:tcPr>
-            <w:tcW w:type="dxa" w:w="3888"/>
-            <w:shd w:fill="D9EAF7"/>
+            <w:tcW w:type="dxa" w:w="3456"/>
           </w:tcPr>
           <w:p>
+            <w:pPr>
+              <w:spacing w:before="0" w:after="0"/>
+            </w:pPr>
             <w:r>
               <w:rPr>
-                <w:b/>
-                <w:sz w:val="16"/>
-              </w:rPr>
-              <w:t>Character</w:t>
-            </w:r>
-          </w:p>
-        </w:tc>
-        <w:tc>
-          <w:tcPr>
-            <w:tcW w:type="dxa" w:w="1152"/>
-            <w:shd w:fill="D9EAF7"/>
-          </w:tcPr>
-          <w:p>
-            <w:r>
-              <w:rPr>
-                <w:b/>
                 <w:sz w:val="16"/>
               </w:rPr>
               <w:t>Rows</w:t>
@@ -372,55 +956,208 @@
         </w:tc>
         <w:tc>
           <w:tcPr>
-            <w:tcW w:type="dxa" w:w="2160"/>
-            <w:shd w:fill="D9EAF7"/>
+            <w:tcW w:type="dxa" w:w="3456"/>
           </w:tcPr>
           <w:p>
+            <w:pPr>
+              <w:spacing w:before="0" w:after="0"/>
+            </w:pPr>
             <w:r>
               <w:rPr>
-                <w:b/>
                 <w:sz w:val="16"/>
               </w:rPr>
-              <w:t>Recorded spend</w:t>
+              <w:t>Expense total</w:t>
             </w:r>
           </w:p>
         </w:tc>
       </w:tr>
       <w:tr>
+        <w:trPr>
+          <w:cantSplit/>
+        </w:trPr>
         <w:tc>
           <w:tcPr>
-            <w:tcW w:type="dxa" w:w="1440"/>
-            <w:vAlign w:val="center"/>
+            <w:tcW w:type="dxa" w:w="3456"/>
           </w:tcPr>
           <w:p>
+            <w:pPr>
+              <w:spacing w:before="0" w:after="0"/>
+            </w:pPr>
             <w:r>
               <w:rPr>
                 <w:sz w:val="16"/>
               </w:rPr>
-              <w:t>Phase 1</w:t>
+              <w:t>2023-01</w:t>
             </w:r>
           </w:p>
         </w:tc>
         <w:tc>
           <w:tcPr>
-            <w:tcW w:type="dxa" w:w="3888"/>
-            <w:vAlign w:val="center"/>
+            <w:tcW w:type="dxa" w:w="3456"/>
           </w:tcPr>
           <w:p>
+            <w:pPr>
+              <w:spacing w:before="0" w:after="0"/>
+            </w:pPr>
             <w:r>
               <w:rPr>
                 <w:sz w:val="16"/>
               </w:rPr>
-              <w:t>Startup</w:t>
+              <w:t>5</w:t>
             </w:r>
           </w:p>
         </w:tc>
         <w:tc>
           <w:tcPr>
-            <w:tcW w:type="dxa" w:w="1152"/>
-            <w:vAlign w:val="center"/>
+            <w:tcW w:type="dxa" w:w="3456"/>
           </w:tcPr>
           <w:p>
+            <w:pPr>
+              <w:spacing w:before="0" w:after="0"/>
+            </w:pPr>
+            <w:r>
+              <w:rPr>
+                <w:sz w:val="16"/>
+              </w:rPr>
+              <w:t>$292</w:t>
+            </w:r>
+          </w:p>
+        </w:tc>
+      </w:tr>
+      <w:tr>
+        <w:trPr>
+          <w:cantSplit/>
+        </w:trPr>
+        <w:tc>
+          <w:tcPr>
+            <w:tcW w:type="dxa" w:w="3456"/>
+          </w:tcPr>
+          <w:p>
+            <w:pPr>
+              <w:spacing w:before="0" w:after="0"/>
+            </w:pPr>
+            <w:r>
+              <w:rPr>
+                <w:sz w:val="16"/>
+              </w:rPr>
+              <w:t>2023-06</w:t>
+            </w:r>
+          </w:p>
+        </w:tc>
+        <w:tc>
+          <w:tcPr>
+            <w:tcW w:type="dxa" w:w="3456"/>
+          </w:tcPr>
+          <w:p>
+            <w:pPr>
+              <w:spacing w:before="0" w:after="0"/>
+            </w:pPr>
+            <w:r>
+              <w:rPr>
+                <w:sz w:val="16"/>
+              </w:rPr>
+              <w:t>28</w:t>
+            </w:r>
+          </w:p>
+        </w:tc>
+        <w:tc>
+          <w:tcPr>
+            <w:tcW w:type="dxa" w:w="3456"/>
+          </w:tcPr>
+          <w:p>
+            <w:pPr>
+              <w:spacing w:before="0" w:after="0"/>
+            </w:pPr>
+            <w:r>
+              <w:rPr>
+                <w:sz w:val="16"/>
+              </w:rPr>
+              <w:t>$44,660</w:t>
+            </w:r>
+          </w:p>
+        </w:tc>
+      </w:tr>
+      <w:tr>
+        <w:trPr>
+          <w:cantSplit/>
+        </w:trPr>
+        <w:tc>
+          <w:tcPr>
+            <w:tcW w:type="dxa" w:w="3456"/>
+          </w:tcPr>
+          <w:p>
+            <w:pPr>
+              <w:spacing w:before="0" w:after="0"/>
+            </w:pPr>
+            <w:r>
+              <w:rPr>
+                <w:sz w:val="16"/>
+              </w:rPr>
+              <w:t>2023-11</w:t>
+            </w:r>
+          </w:p>
+        </w:tc>
+        <w:tc>
+          <w:tcPr>
+            <w:tcW w:type="dxa" w:w="3456"/>
+          </w:tcPr>
+          <w:p>
+            <w:pPr>
+              <w:spacing w:before="0" w:after="0"/>
+            </w:pPr>
+            <w:r>
+              <w:rPr>
+                <w:sz w:val="16"/>
+              </w:rPr>
+              <w:t>75</w:t>
+            </w:r>
+          </w:p>
+        </w:tc>
+        <w:tc>
+          <w:tcPr>
+            <w:tcW w:type="dxa" w:w="3456"/>
+          </w:tcPr>
+          <w:p>
+            <w:pPr>
+              <w:spacing w:before="0" w:after="0"/>
+            </w:pPr>
+            <w:r>
+              <w:rPr>
+                <w:sz w:val="16"/>
+              </w:rPr>
+              <w:t>$416,686</w:t>
+            </w:r>
+          </w:p>
+        </w:tc>
+      </w:tr>
+      <w:tr>
+        <w:trPr>
+          <w:cantSplit/>
+        </w:trPr>
+        <w:tc>
+          <w:tcPr>
+            <w:tcW w:type="dxa" w:w="3456"/>
+          </w:tcPr>
+          <w:p>
+            <w:pPr>
+              <w:spacing w:before="0" w:after="0"/>
+            </w:pPr>
+            <w:r>
+              <w:rPr>
+                <w:sz w:val="16"/>
+              </w:rPr>
+              <w:t>2024-05</w:t>
+            </w:r>
+          </w:p>
+        </w:tc>
+        <w:tc>
+          <w:tcPr>
+            <w:tcW w:type="dxa" w:w="3456"/>
+          </w:tcPr>
+          <w:p>
+            <w:pPr>
+              <w:spacing w:before="0" w:after="0"/>
+            </w:pPr>
             <w:r>
               <w:rPr>
                 <w:sz w:val="16"/>
@@ -431,247 +1168,229 @@
         </w:tc>
         <w:tc>
           <w:tcPr>
-            <w:tcW w:type="dxa" w:w="2160"/>
-            <w:vAlign w:val="center"/>
+            <w:tcW w:type="dxa" w:w="3456"/>
           </w:tcPr>
           <w:p>
+            <w:pPr>
+              <w:spacing w:before="0" w:after="0"/>
+            </w:pPr>
             <w:r>
               <w:rPr>
                 <w:sz w:val="16"/>
               </w:rPr>
-              <w:t>$69,987.59</w:t>
+              <w:t>$889,892</w:t>
             </w:r>
           </w:p>
         </w:tc>
       </w:tr>
       <w:tr>
+        <w:trPr>
+          <w:cantSplit/>
+        </w:trPr>
         <w:tc>
           <w:tcPr>
-            <w:tcW w:type="dxa" w:w="1440"/>
-            <w:vAlign w:val="center"/>
+            <w:tcW w:type="dxa" w:w="3456"/>
           </w:tcPr>
           <w:p>
+            <w:pPr>
+              <w:spacing w:before="0" w:after="0"/>
+            </w:pPr>
             <w:r>
               <w:rPr>
                 <w:sz w:val="16"/>
               </w:rPr>
-              <w:t>Phase 2</w:t>
+              <w:t>2024-07</w:t>
             </w:r>
           </w:p>
         </w:tc>
         <w:tc>
           <w:tcPr>
-            <w:tcW w:type="dxa" w:w="3888"/>
-            <w:vAlign w:val="center"/>
+            <w:tcW w:type="dxa" w:w="3456"/>
           </w:tcPr>
           <w:p>
+            <w:pPr>
+              <w:spacing w:before="0" w:after="0"/>
+            </w:pPr>
             <w:r>
               <w:rPr>
                 <w:sz w:val="16"/>
               </w:rPr>
-              <w:t>Growth</w:t>
+              <w:t>35</w:t>
             </w:r>
           </w:p>
         </w:tc>
         <w:tc>
           <w:tcPr>
-            <w:tcW w:type="dxa" w:w="1152"/>
-            <w:vAlign w:val="center"/>
+            <w:tcW w:type="dxa" w:w="3456"/>
           </w:tcPr>
           <w:p>
+            <w:pPr>
+              <w:spacing w:before="0" w:after="0"/>
+            </w:pPr>
             <w:r>
               <w:rPr>
                 <w:sz w:val="16"/>
               </w:rPr>
-              <w:t>650</w:t>
+              <w:t>$254,359</w:t>
+            </w:r>
+          </w:p>
+        </w:tc>
+      </w:tr>
+      <w:tr>
+        <w:trPr>
+          <w:cantSplit/>
+        </w:trPr>
+        <w:tc>
+          <w:tcPr>
+            <w:tcW w:type="dxa" w:w="3456"/>
+          </w:tcPr>
+          <w:p>
+            <w:pPr>
+              <w:spacing w:before="0" w:after="0"/>
+            </w:pPr>
+            <w:r>
+              <w:rPr>
+                <w:sz w:val="16"/>
+              </w:rPr>
+              <w:t>2024-09</w:t>
             </w:r>
           </w:p>
         </w:tc>
         <w:tc>
           <w:tcPr>
-            <w:tcW w:type="dxa" w:w="2160"/>
-            <w:vAlign w:val="center"/>
+            <w:tcW w:type="dxa" w:w="3456"/>
           </w:tcPr>
           <w:p>
+            <w:pPr>
+              <w:spacing w:before="0" w:after="0"/>
+            </w:pPr>
             <w:r>
               <w:rPr>
                 <w:sz w:val="16"/>
               </w:rPr>
-              <w:t>$2,244,825.81</w:t>
+              <w:t>55</w:t>
+            </w:r>
+          </w:p>
+        </w:tc>
+        <w:tc>
+          <w:tcPr>
+            <w:tcW w:type="dxa" w:w="3456"/>
+          </w:tcPr>
+          <w:p>
+            <w:pPr>
+              <w:spacing w:before="0" w:after="0"/>
+            </w:pPr>
+            <w:r>
+              <w:rPr>
+                <w:sz w:val="16"/>
+              </w:rPr>
+              <w:t>$448,553</w:t>
             </w:r>
           </w:p>
         </w:tc>
       </w:tr>
       <w:tr>
+        <w:trPr>
+          <w:cantSplit/>
+        </w:trPr>
         <w:tc>
           <w:tcPr>
-            <w:tcW w:type="dxa" w:w="1440"/>
-            <w:vAlign w:val="center"/>
+            <w:tcW w:type="dxa" w:w="3456"/>
           </w:tcPr>
           <w:p>
+            <w:pPr>
+              <w:spacing w:before="0" w:after="0"/>
+            </w:pPr>
             <w:r>
               <w:rPr>
                 <w:sz w:val="16"/>
               </w:rPr>
-              <w:t>Phase 3</w:t>
+              <w:t>2025-01</w:t>
             </w:r>
           </w:p>
         </w:tc>
         <w:tc>
           <w:tcPr>
-            <w:tcW w:type="dxa" w:w="3888"/>
-            <w:vAlign w:val="center"/>
+            <w:tcW w:type="dxa" w:w="3456"/>
           </w:tcPr>
           <w:p>
+            <w:pPr>
+              <w:spacing w:before="0" w:after="0"/>
+            </w:pPr>
             <w:r>
               <w:rPr>
                 <w:sz w:val="16"/>
               </w:rPr>
-              <w:t>Crisis</w:t>
+              <w:t>85</w:t>
             </w:r>
           </w:p>
         </w:tc>
         <w:tc>
           <w:tcPr>
-            <w:tcW w:type="dxa" w:w="1152"/>
-            <w:vAlign w:val="center"/>
+            <w:tcW w:type="dxa" w:w="3456"/>
           </w:tcPr>
           <w:p>
+            <w:pPr>
+              <w:spacing w:before="0" w:after="0"/>
+            </w:pPr>
             <w:r>
               <w:rPr>
                 <w:sz w:val="16"/>
               </w:rPr>
-              <w:t>240</w:t>
+              <w:t>$742,380</w:t>
+            </w:r>
+          </w:p>
+        </w:tc>
+      </w:tr>
+      <w:tr>
+        <w:trPr>
+          <w:cantSplit/>
+        </w:trPr>
+        <w:tc>
+          <w:tcPr>
+            <w:tcW w:type="dxa" w:w="3456"/>
+          </w:tcPr>
+          <w:p>
+            <w:pPr>
+              <w:spacing w:before="0" w:after="0"/>
+            </w:pPr>
+            <w:r>
+              <w:rPr>
+                <w:sz w:val="16"/>
+              </w:rPr>
+              <w:t>2025-04</w:t>
             </w:r>
           </w:p>
         </w:tc>
         <w:tc>
           <w:tcPr>
-            <w:tcW w:type="dxa" w:w="2160"/>
-            <w:vAlign w:val="center"/>
+            <w:tcW w:type="dxa" w:w="3456"/>
           </w:tcPr>
           <w:p>
+            <w:pPr>
+              <w:spacing w:before="0" w:after="0"/>
+            </w:pPr>
             <w:r>
               <w:rPr>
                 <w:sz w:val="16"/>
               </w:rPr>
-              <w:t>$2,328,609.73</w:t>
-            </w:r>
-          </w:p>
-        </w:tc>
-      </w:tr>
-      <w:tr>
-        <w:tc>
-          <w:tcPr>
-            <w:tcW w:type="dxa" w:w="1440"/>
-            <w:vAlign w:val="center"/>
-          </w:tcPr>
-          <w:p>
-            <w:r>
-              <w:rPr>
-                <w:sz w:val="16"/>
-              </w:rPr>
-              <w:t>Phase 4</w:t>
+              <w:t>100</w:t>
             </w:r>
           </w:p>
         </w:tc>
         <w:tc>
           <w:tcPr>
-            <w:tcW w:type="dxa" w:w="3888"/>
-            <w:vAlign w:val="center"/>
+            <w:tcW w:type="dxa" w:w="3456"/>
           </w:tcPr>
           <w:p>
+            <w:pPr>
+              <w:spacing w:before="0" w:after="0"/>
+            </w:pPr>
             <w:r>
               <w:rPr>
                 <w:sz w:val="16"/>
               </w:rPr>
-              <w:t>Pivot / recovery</w:t>
-            </w:r>
-          </w:p>
-        </w:tc>
-        <w:tc>
-          <w:tcPr>
-            <w:tcW w:type="dxa" w:w="1152"/>
-            <w:vAlign w:val="center"/>
-          </w:tcPr>
-          <w:p>
-            <w:r>
-              <w:rPr>
-                <w:sz w:val="16"/>
-              </w:rPr>
-              <w:t>410</w:t>
-            </w:r>
-          </w:p>
-        </w:tc>
-        <w:tc>
-          <w:tcPr>
-            <w:tcW w:type="dxa" w:w="2160"/>
-            <w:vAlign w:val="center"/>
-          </w:tcPr>
-          <w:p>
-            <w:r>
-              <w:rPr>
-                <w:sz w:val="16"/>
-              </w:rPr>
-              <w:t>$2,206,786.55</w:t>
-            </w:r>
-          </w:p>
-        </w:tc>
-      </w:tr>
-      <w:tr>
-        <w:tc>
-          <w:tcPr>
-            <w:tcW w:type="dxa" w:w="1440"/>
-            <w:vAlign w:val="center"/>
-          </w:tcPr>
-          <w:p>
-            <w:r>
-              <w:rPr>
-                <w:sz w:val="16"/>
-              </w:rPr>
-              <w:t>Phase 5</w:t>
-            </w:r>
-          </w:p>
-        </w:tc>
-        <w:tc>
-          <w:tcPr>
-            <w:tcW w:type="dxa" w:w="3888"/>
-            <w:vAlign w:val="center"/>
-          </w:tcPr>
-          <w:p>
-            <w:r>
-              <w:rPr>
-                <w:sz w:val="16"/>
-              </w:rPr>
-              <w:t>Current snapshot</w:t>
-            </w:r>
-          </w:p>
-        </w:tc>
-        <w:tc>
-          <w:tcPr>
-            <w:tcW w:type="dxa" w:w="1152"/>
-            <w:vAlign w:val="center"/>
-          </w:tcPr>
-          <w:p>
-            <w:r>
-              <w:rPr>
-                <w:sz w:val="16"/>
-              </w:rPr>
-              <w:t>40</w:t>
-            </w:r>
-          </w:p>
-        </w:tc>
-        <w:tc>
-          <w:tcPr>
-            <w:tcW w:type="dxa" w:w="2160"/>
-            <w:vAlign w:val="center"/>
-          </w:tcPr>
-          <w:p>
-            <w:r>
-              <w:rPr>
-                <w:sz w:val="16"/>
-              </w:rPr>
-              <w:t>$161,558.83</w:t>
+              <w:t>$963,610</w:t>
             </w:r>
           </w:p>
         </w:tc>
@@ -679,7 +1398,7 @@
     </w:tbl>
     <w:p>
       <w:r>
-        <w:t>Total: 1,450 rows from 2023-01-23 through 2025-04-30; recorded non-payroll spending $7,011,768.51. The largest single expense is $77,294.47.</w:t>
+        <w:t>Monthly totals are deliberately irregular rather than perfectly smooth. May 2024 remains expensive because of professional-service and response costs; July 2024 shows the shutdown trough; spending then rebuilds through the post-pivot recovery.</w:t>
       </w:r>
     </w:p>
     <w:p>
@@ -687,304 +1406,26 @@
         <w:pStyle w:val="Heading1"/>
       </w:pPr>
       <w:r>
-        <w:t>4. Helper CSV</w:t>
+        <w:t>7. Helper CSV</w:t>
       </w:r>
     </w:p>
     <w:p>
       <w:r>
-        <w:t>The helper export is intended only for dataset navigation and QA. It preserves all seven canonical columns and appends the following fields:</w:t>
+        <w:t>sqlvalley_expenses_with_helpers.csv contains the same 1,708 core rows plus navigation-only fields:</w:t>
       </w:r>
     </w:p>
-    <w:tbl>
-      <w:tblPr>
-        <w:tblStyle w:val="TableGrid"/>
-        <w:tblW w:type="auto" w:w="0"/>
-        <w:jc w:val="center"/>
-        <w:tblLook w:firstColumn="1" w:firstRow="1" w:lastColumn="0" w:lastRow="0" w:noHBand="0" w:noVBand="1" w:val="04A0"/>
-      </w:tblPr>
-      <w:tblGrid>
-        <w:gridCol w:w="5184"/>
-        <w:gridCol w:w="5184"/>
-      </w:tblGrid>
-      <w:tr>
-        <w:trPr>
-          <w:tblHeader w:val="true"/>
-        </w:trPr>
-        <w:tc>
-          <w:tcPr>
-            <w:tcW w:type="dxa" w:w="2880"/>
-            <w:shd w:fill="D9EAF7"/>
-          </w:tcPr>
-          <w:p>
-            <w:r>
-              <w:rPr>
-                <w:b/>
-                <w:sz w:val="15"/>
-              </w:rPr>
-              <w:t>Helper field</w:t>
-            </w:r>
-          </w:p>
-        </w:tc>
-        <w:tc>
-          <w:tcPr>
-            <w:tcW w:type="dxa" w:w="8496"/>
-            <w:shd w:fill="D9EAF7"/>
-          </w:tcPr>
-          <w:p>
-            <w:r>
-              <w:rPr>
-                <w:b/>
-                <w:sz w:val="15"/>
-              </w:rPr>
-              <w:t>Purpose</w:t>
-            </w:r>
-          </w:p>
-        </w:tc>
-      </w:tr>
-      <w:tr>
-        <w:tc>
-          <w:tcPr>
-            <w:tcW w:type="dxa" w:w="2880"/>
-            <w:vAlign w:val="center"/>
-          </w:tcPr>
-          <w:p>
-            <w:r>
-              <w:rPr>
-                <w:sz w:val="15"/>
-              </w:rPr>
-              <w:t>phase</w:t>
-            </w:r>
-          </w:p>
-        </w:tc>
-        <w:tc>
-          <w:tcPr>
-            <w:tcW w:type="dxa" w:w="8496"/>
-            <w:vAlign w:val="center"/>
-          </w:tcPr>
-          <w:p>
-            <w:r>
-              <w:rPr>
-                <w:sz w:val="15"/>
-              </w:rPr>
-              <w:t>Numeric story phase.</w:t>
-            </w:r>
-          </w:p>
-        </w:tc>
-      </w:tr>
-      <w:tr>
-        <w:tc>
-          <w:tcPr>
-            <w:tcW w:type="dxa" w:w="2880"/>
-            <w:vAlign w:val="center"/>
-          </w:tcPr>
-          <w:p>
-            <w:r>
-              <w:rPr>
-                <w:sz w:val="15"/>
-              </w:rPr>
-              <w:t>phase_name</w:t>
-            </w:r>
-          </w:p>
-        </w:tc>
-        <w:tc>
-          <w:tcPr>
-            <w:tcW w:type="dxa" w:w="8496"/>
-            <w:vAlign w:val="center"/>
-          </w:tcPr>
-          <w:p>
-            <w:r>
-              <w:rPr>
-                <w:sz w:val="15"/>
-              </w:rPr>
-              <w:t>Readable phase label.</w:t>
-            </w:r>
-          </w:p>
-        </w:tc>
-      </w:tr>
-      <w:tr>
-        <w:tc>
-          <w:tcPr>
-            <w:tcW w:type="dxa" w:w="2880"/>
-            <w:vAlign w:val="center"/>
-          </w:tcPr>
-          <w:p>
-            <w:r>
-              <w:rPr>
-                <w:sz w:val="15"/>
-              </w:rPr>
-              <w:t>timeline_segment</w:t>
-            </w:r>
-          </w:p>
-        </w:tc>
-        <w:tc>
-          <w:tcPr>
-            <w:tcW w:type="dxa" w:w="8496"/>
-            <w:vAlign w:val="center"/>
-          </w:tcPr>
-          <w:p>
-            <w:r>
-              <w:rPr>
-                <w:sz w:val="15"/>
-              </w:rPr>
-              <w:t>Generation period / nearby timeline context.</w:t>
-            </w:r>
-          </w:p>
-        </w:tc>
-      </w:tr>
-      <w:tr>
-        <w:tc>
-          <w:tcPr>
-            <w:tcW w:type="dxa" w:w="2880"/>
-            <w:vAlign w:val="center"/>
-          </w:tcPr>
-          <w:p>
-            <w:r>
-              <w:rPr>
-                <w:sz w:val="15"/>
-              </w:rPr>
-              <w:t>expense_type</w:t>
-            </w:r>
-          </w:p>
-        </w:tc>
-        <w:tc>
-          <w:tcPr>
-            <w:tcW w:type="dxa" w:w="8496"/>
-            <w:vAlign w:val="center"/>
-          </w:tcPr>
-          <w:p>
-            <w:r>
-              <w:rPr>
-                <w:sz w:val="15"/>
-              </w:rPr>
-              <w:t>Operational expense category used during generation.</w:t>
-            </w:r>
-          </w:p>
-        </w:tc>
-      </w:tr>
-      <w:tr>
-        <w:tc>
-          <w:tcPr>
-            <w:tcW w:type="dxa" w:w="2880"/>
-            <w:vAlign w:val="center"/>
-          </w:tcPr>
-          <w:p>
-            <w:r>
-              <w:rPr>
-                <w:sz w:val="15"/>
-              </w:rPr>
-              <w:t>month</w:t>
-            </w:r>
-          </w:p>
-        </w:tc>
-        <w:tc>
-          <w:tcPr>
-            <w:tcW w:type="dxa" w:w="8496"/>
-            <w:vAlign w:val="center"/>
-          </w:tcPr>
-          <w:p>
-            <w:r>
-              <w:rPr>
-                <w:sz w:val="15"/>
-              </w:rPr>
-              <w:t>YYYY-MM month key for quick filtering.</w:t>
-            </w:r>
-          </w:p>
-        </w:tc>
-      </w:tr>
-      <w:tr>
-        <w:tc>
-          <w:tcPr>
-            <w:tcW w:type="dxa" w:w="2880"/>
-            <w:vAlign w:val="center"/>
-          </w:tcPr>
-          <w:p>
-            <w:r>
-              <w:rPr>
-                <w:sz w:val="15"/>
-              </w:rPr>
-              <w:t>department_name</w:t>
-            </w:r>
-          </w:p>
-        </w:tc>
-        <w:tc>
-          <w:tcPr>
-            <w:tcW w:type="dxa" w:w="8496"/>
-            <w:vAlign w:val="center"/>
-          </w:tcPr>
-          <w:p>
-            <w:r>
-              <w:rPr>
-                <w:sz w:val="15"/>
-              </w:rPr>
-              <w:t>Readable lookup for d_id.</w:t>
-            </w:r>
-          </w:p>
-        </w:tc>
-      </w:tr>
-      <w:tr>
-        <w:tc>
-          <w:tcPr>
-            <w:tcW w:type="dxa" w:w="2880"/>
-            <w:vAlign w:val="center"/>
-          </w:tcPr>
-          <w:p>
-            <w:r>
-              <w:rPr>
-                <w:sz w:val="15"/>
-              </w:rPr>
-              <w:t>requester_name</w:t>
-            </w:r>
-          </w:p>
-        </w:tc>
-        <w:tc>
-          <w:tcPr>
-            <w:tcW w:type="dxa" w:w="8496"/>
-            <w:vAlign w:val="center"/>
-          </w:tcPr>
-          <w:p>
-            <w:r>
-              <w:rPr>
-                <w:sz w:val="15"/>
-              </w:rPr>
-              <w:t>Readable lookup for requested_by.</w:t>
-            </w:r>
-          </w:p>
-        </w:tc>
-      </w:tr>
-      <w:tr>
-        <w:tc>
-          <w:tcPr>
-            <w:tcW w:type="dxa" w:w="2880"/>
-            <w:vAlign w:val="center"/>
-          </w:tcPr>
-          <w:p>
-            <w:r>
-              <w:rPr>
-                <w:sz w:val="15"/>
-              </w:rPr>
-              <w:t>approver_name</w:t>
-            </w:r>
-          </w:p>
-        </w:tc>
-        <w:tc>
-          <w:tcPr>
-            <w:tcW w:type="dxa" w:w="8496"/>
-            <w:vAlign w:val="center"/>
-          </w:tcPr>
-          <w:p>
-            <w:r>
-              <w:rPr>
-                <w:sz w:val="15"/>
-              </w:rPr>
-              <w:t>Readable lookup for approved_by.</w:t>
-            </w:r>
-          </w:p>
-        </w:tc>
-      </w:tr>
-    </w:tbl>
     <w:p>
       <w:r>
-        <w:t>Helper fields must not be added to the production SQL schema. They exist so the dataset can be inspected, filtered and edited efficiently before exercise-specific rows are introduced.</w:t>
+        <w:rPr>
+          <w:rFonts w:ascii="Consolas" w:hAnsi="Consolas"/>
+          <w:sz w:val="17"/>
+        </w:rPr>
+        <w:t>phase, phase_name, timeline_segment, expense_type, month, quarter, department_name_at_time, requester_name, approver_name, requester_role, approver_role</w:t>
+      </w:r>
+    </w:p>
+    <w:p>
+      <w:r>
+        <w:t>These fields are not part of the canonical SQL schema. department_name_at_time uses the historical name in effect on the expense date, which is useful around the 2023/2024 department repurposing.</w:t>
       </w:r>
     </w:p>
     <w:p>
@@ -992,72 +1433,12 @@
         <w:pStyle w:val="Heading1"/>
       </w:pPr>
       <w:r>
-        <w:t>5. Historical behavior</w:t>
-      </w:r>
-    </w:p>
-    <w:p>
-      <w:pPr>
-        <w:pStyle w:val="Heading2"/>
-      </w:pPr>
-      <w:r>
-        <w:t>Phase 1 - Startup</w:t>
+        <w:t>8. Source-priority note</w:t>
       </w:r>
     </w:p>
     <w:p>
       <w:r>
-        <w:t>110 backfilled founder expenses. Requests are small, descriptions are informal and inconsistent, and requested_by / approved_by are NULL because Caesar and Bob were not yet formal employees. Spending moves from domains and hosting into launch marketing, legal setup, insurance, photography and first-partnership handling.</w:t>
-      </w:r>
-    </w:p>
-    <w:p>
-      <w:pPr>
-        <w:pStyle w:val="Heading2"/>
-      </w:pPr>
-      <w:r>
-        <w:t>Phase 2 - Growth</w:t>
-      </w:r>
-    </w:p>
-    <w:p>
-      <w:r>
-        <w:t>Expense volume expands sharply after accelerator entry and seed funding. Hiring creates hardware, recruiting, onboarding and software costs. Partnership growth adds appraisal, provenance, transport, storage and insurance. Viral press coverage in November 2023 creates a visible infrastructure/support/recruiting burst. Descriptions become progressively standardized and approvals become normal.</w:t>
-      </w:r>
-    </w:p>
-    <w:p>
-      <w:pPr>
-        <w:pStyle w:val="Heading2"/>
-      </w:pPr>
-      <w:r>
-        <w:t>Phase 3 - Loophole and crisis</w:t>
-      </w:r>
-    </w:p>
-    <w:p>
-      <w:r>
-        <w:t>Legal, compliance, reconciliation, custody and communications spending begins rising in late April 2024 and peaks after the May leak. Recruitment and ordinary expansion spending decline. The June shutdown then collapses discretionary traffic while legal, storage, insurance and essential infrastructure remain as a cost floor.</w:t>
-      </w:r>
-    </w:p>
-    <w:p>
-      <w:pPr>
-        <w:pStyle w:val="Heading2"/>
-      </w:pPr>
-      <w:r>
-        <w:t>Phase 4 - Pivot and recovery</w:t>
-      </w:r>
-    </w:p>
-    <w:p>
-      <w:r>
-        <w:t>Spending resumes selectively after the August board intervention. The mix moves away from public marketing and museum outreach toward data migration, private sales, KYC, provenance, valuation, custody, insurance and transaction operations. Monthly volume grows again through April 2025 but approvals stay more disciplined than during pre-crisis expansion.</w:t>
-      </w:r>
-    </w:p>
-    <w:p>
-      <w:pPr>
-        <w:pStyle w:val="Heading2"/>
-      </w:pPr>
-      <w:r>
-        <w:t>Phase 5 - Current snapshot</w:t>
-      </w:r>
-    </w:p>
-    <w:p>
-      <w:r>
-        <w:t>Ordinary marketplace spending continues through the final April 2025 snapshot. This baseline intentionally contains no seeded fraud, tampering, suspicious approval pattern, or other exercise-specific anomaly; such rows can be added later without contaminating the filler data.</w:t>
+        <w:t>The organizational sequence follows the departments and employees timelines. Exact requester/approver availability is validated against the current employee and contract data. If a narrative milestone and an actual employee hire date differ, the employee/contract date governs when that ID can first appear in expenses; this prevents invalid historical employee references.</w:t>
       </w:r>
     </w:p>
     <w:p>
@@ -1065,12 +1446,119 @@
         <w:pStyle w:val="Heading1"/>
       </w:pPr>
       <w:r>
-        <w:t>6. Description style</w:t>
+        <w:t>9. Validation results</w:t>
       </w:r>
     </w:p>
     <w:p>
+      <w:pPr>
+        <w:ind w:left="230" w:hanging="173"/>
+      </w:pPr>
       <w:r>
-        <w:t>Description wording intentionally evolves with the company. Early rows include entries such as “hosting”, “office stuff”, and “lawyer”. By late growth and recovery, descriptions look like normal accounting records such as “Cloud infrastructure - Nov 2023”, “Seller provenance review”, or “Secure custody transfer”. Crisis descriptions stay professional but show urgency through subjects such as ownership review, communications advisory, restructuring and contract termination. The table never labels story beats directly.</w:t>
+        <w:rPr>
+          <w:b/>
+        </w:rPr>
+        <w:t xml:space="preserve">• </w:t>
+      </w:r>
+      <w:r>
+        <w:t>1,708 unique exp_id values.</w:t>
+      </w:r>
+    </w:p>
+    <w:p>
+      <w:pPr>
+        <w:ind w:left="230" w:hanging="173"/>
+      </w:pPr>
+      <w:r>
+        <w:rPr>
+          <w:b/>
+        </w:rPr>
+        <w:t xml:space="preserve">• </w:t>
+      </w:r>
+      <w:r>
+        <w:t>All pre-23 June 2023 rows have NULL d_id, requested_by and approved_by.</w:t>
+      </w:r>
+    </w:p>
+    <w:p>
+      <w:pPr>
+        <w:ind w:left="230" w:hanging="173"/>
+      </w:pPr>
+      <w:r>
+        <w:rPr>
+          <w:b/>
+        </w:rPr>
+        <w:t xml:space="preserve">• </w:t>
+      </w:r>
+      <w:r>
+        <w:t>No department appears before its canonical creation date.</w:t>
+      </w:r>
+    </w:p>
+    <w:p>
+      <w:pPr>
+        <w:ind w:left="230" w:hanging="173"/>
+      </w:pPr>
+      <w:r>
+        <w:rPr>
+          <w:b/>
+        </w:rPr>
+        <w:t xml:space="preserve">• </w:t>
+      </w:r>
+      <w:r>
+        <w:t>All non-NULL employee references exist and are employed on the expense date.</w:t>
+      </w:r>
+    </w:p>
+    <w:p>
+      <w:pPr>
+        <w:ind w:left="230" w:hanging="173"/>
+      </w:pPr>
+      <w:r>
+        <w:rPr>
+          <w:b/>
+        </w:rPr>
+        <w:t xml:space="preserve">• </w:t>
+      </w:r>
+      <w:r>
+        <w:t>Former employees are not used after their final employment date.</w:t>
+      </w:r>
+    </w:p>
+    <w:p>
+      <w:pPr>
+        <w:ind w:left="230" w:hanging="173"/>
+      </w:pPr>
+      <w:r>
+        <w:rPr>
+          <w:b/>
+        </w:rPr>
+        <w:t xml:space="preserve">• </w:t>
+      </w:r>
+      <w:r>
+        <w:t>Employees on recorded leave are not used for generated approvals/requests during that leave.</w:t>
+      </w:r>
+    </w:p>
+    <w:p>
+      <w:pPr>
+        <w:ind w:left="230" w:hanging="173"/>
+      </w:pPr>
+      <w:r>
+        <w:rPr>
+          <w:b/>
+        </w:rPr>
+        <w:t xml:space="preserve">• </w:t>
+      </w:r>
+      <w:r>
+        <w:t>0 self-approved baseline expenses.</w:t>
+      </w:r>
+    </w:p>
+    <w:p>
+      <w:pPr>
+        <w:ind w:left="230" w:hanging="173"/>
+      </w:pPr>
+      <w:r>
+        <w:rPr>
+          <w:b/>
+        </w:rPr>
+        <w:t xml:space="preserve">• </w:t>
+      </w:r>
+      <w:r>
+        <w:t>0 deliberately seeded tampering/exercise rows.</w:t>
       </w:r>
     </w:p>
     <w:p>
@@ -1078,1634 +1566,29 @@
         <w:pStyle w:val="Heading1"/>
       </w:pPr>
       <w:r>
-        <w:t>7. Referential and temporal rules</w:t>
-      </w:r>
-    </w:p>
-    <w:p>
-      <w:pPr>
-        <w:pStyle w:val="ListBullet"/>
-      </w:pPr>
-      <w:r>
-        <w:t>Every non-NULL requested_by and approved_by value exists in employees(e_id).</w:t>
-      </w:r>
-    </w:p>
-    <w:p>
-      <w:pPr>
-        <w:pStyle w:val="ListBullet"/>
-      </w:pPr>
-      <w:r>
-        <w:t>Every d_id exists in the canonical hierarchical departments table.</w:t>
-      </w:r>
-    </w:p>
-    <w:p>
-      <w:pPr>
-        <w:pStyle w:val="ListBullet"/>
-      </w:pPr>
-      <w:r>
-        <w:t>Employee references occur only while the employee is available for work; PTO, sick leave and Marcelle’s sabbatical are excluded from requester/approver assignment.</w:t>
-      </w:r>
-    </w:p>
-    <w:p>
-      <w:pPr>
-        <w:pStyle w:val="ListBullet"/>
-      </w:pPr>
-      <w:r>
-        <w:t>Phase 1 founder receipts are intentionally NULL for employee references rather than backdated to employee IDs that did not yet exist.</w:t>
-      </w:r>
-    </w:p>
-    <w:p>
-      <w:pPr>
-        <w:pStyle w:val="ListBullet"/>
-      </w:pPr>
-      <w:r>
-        <w:t>Requesters normally come from the charged department or a believable leadership fallback for periods before that team was staffed.</w:t>
-      </w:r>
-    </w:p>
-    <w:p>
-      <w:pPr>
-        <w:pStyle w:val="ListBullet"/>
-      </w:pPr>
-      <w:r>
-        <w:t>Approvers generally come from active managers, founders, Finance, or senior leadership. Mature-period self-approval is intentionally rare.</w:t>
-      </w:r>
-    </w:p>
-    <w:p>
-      <w:pPr>
-        <w:pStyle w:val="Heading1"/>
-      </w:pPr>
-      <w:r>
-        <w:t>8. Department footprint</w:t>
-      </w:r>
-    </w:p>
-    <w:tbl>
-      <w:tblPr>
-        <w:tblStyle w:val="TableGrid"/>
-        <w:tblW w:type="auto" w:w="0"/>
-        <w:jc w:val="center"/>
-        <w:tblLook w:firstColumn="1" w:firstRow="1" w:lastColumn="0" w:lastRow="0" w:noHBand="0" w:noVBand="1" w:val="04A0"/>
-      </w:tblPr>
-      <w:tblGrid>
-        <w:gridCol w:w="2592"/>
-        <w:gridCol w:w="2592"/>
-        <w:gridCol w:w="2592"/>
-        <w:gridCol w:w="2592"/>
-      </w:tblGrid>
-      <w:tr>
-        <w:trPr>
-          <w:tblHeader w:val="true"/>
-        </w:trPr>
-        <w:tc>
-          <w:tcPr>
-            <w:tcW w:type="dxa" w:w="1152"/>
-            <w:shd w:fill="D9EAF7"/>
-          </w:tcPr>
-          <w:p>
-            <w:r>
-              <w:rPr>
-                <w:b/>
-                <w:sz w:val="15"/>
-              </w:rPr>
-              <w:t>d_id</w:t>
-            </w:r>
-          </w:p>
-        </w:tc>
-        <w:tc>
-          <w:tcPr>
-            <w:tcW w:type="dxa" w:w="4896"/>
-            <w:shd w:fill="D9EAF7"/>
-          </w:tcPr>
-          <w:p>
-            <w:r>
-              <w:rPr>
-                <w:b/>
-                <w:sz w:val="15"/>
-              </w:rPr>
-              <w:t>Department</w:t>
-            </w:r>
-          </w:p>
-        </w:tc>
-        <w:tc>
-          <w:tcPr>
-            <w:tcW w:type="dxa" w:w="1152"/>
-            <w:shd w:fill="D9EAF7"/>
-          </w:tcPr>
-          <w:p>
-            <w:r>
-              <w:rPr>
-                <w:b/>
-                <w:sz w:val="15"/>
-              </w:rPr>
-              <w:t>Rows</w:t>
-            </w:r>
-          </w:p>
-        </w:tc>
-        <w:tc>
-          <w:tcPr>
-            <w:tcW w:type="dxa" w:w="2016"/>
-            <w:shd w:fill="D9EAF7"/>
-          </w:tcPr>
-          <w:p>
-            <w:r>
-              <w:rPr>
-                <w:b/>
-                <w:sz w:val="15"/>
-              </w:rPr>
-              <w:t>Spend</w:t>
-            </w:r>
-          </w:p>
-        </w:tc>
-      </w:tr>
-      <w:tr>
-        <w:tc>
-          <w:tcPr>
-            <w:tcW w:type="dxa" w:w="1152"/>
-            <w:vAlign w:val="center"/>
-          </w:tcPr>
-          <w:p>
-            <w:r>
-              <w:rPr>
-                <w:sz w:val="15"/>
-              </w:rPr>
-              <w:t>2120</w:t>
-            </w:r>
-          </w:p>
-        </w:tc>
-        <w:tc>
-          <w:tcPr>
-            <w:tcW w:type="dxa" w:w="4896"/>
-            <w:vAlign w:val="center"/>
-          </w:tcPr>
-          <w:p>
-            <w:r>
-              <w:rPr>
-                <w:sz w:val="15"/>
-              </w:rPr>
-              <w:t>Software Engineering</w:t>
-            </w:r>
-          </w:p>
-        </w:tc>
-        <w:tc>
-          <w:tcPr>
-            <w:tcW w:type="dxa" w:w="1152"/>
-            <w:vAlign w:val="center"/>
-          </w:tcPr>
-          <w:p>
-            <w:r>
-              <w:rPr>
-                <w:sz w:val="15"/>
-              </w:rPr>
-              <w:t>236</w:t>
-            </w:r>
-          </w:p>
-        </w:tc>
-        <w:tc>
-          <w:tcPr>
-            <w:tcW w:type="dxa" w:w="2016"/>
-            <w:vAlign w:val="center"/>
-          </w:tcPr>
-          <w:p>
-            <w:r>
-              <w:rPr>
-                <w:sz w:val="15"/>
-              </w:rPr>
-              <w:t>$353,074.74</w:t>
-            </w:r>
-          </w:p>
-        </w:tc>
-      </w:tr>
-      <w:tr>
-        <w:tc>
-          <w:tcPr>
-            <w:tcW w:type="dxa" w:w="1152"/>
-            <w:vAlign w:val="center"/>
-          </w:tcPr>
-          <w:p>
-            <w:r>
-              <w:rPr>
-                <w:sz w:val="15"/>
-              </w:rPr>
-              <w:t>4200</w:t>
-            </w:r>
-          </w:p>
-        </w:tc>
-        <w:tc>
-          <w:tcPr>
-            <w:tcW w:type="dxa" w:w="4896"/>
-            <w:vAlign w:val="center"/>
-          </w:tcPr>
-          <w:p>
-            <w:r>
-              <w:rPr>
-                <w:sz w:val="15"/>
-              </w:rPr>
-              <w:t>Logistics &amp; Collections</w:t>
-            </w:r>
-          </w:p>
-        </w:tc>
-        <w:tc>
-          <w:tcPr>
-            <w:tcW w:type="dxa" w:w="1152"/>
-            <w:vAlign w:val="center"/>
-          </w:tcPr>
-          <w:p>
-            <w:r>
-              <w:rPr>
-                <w:sz w:val="15"/>
-              </w:rPr>
-              <w:t>208</w:t>
-            </w:r>
-          </w:p>
-        </w:tc>
-        <w:tc>
-          <w:tcPr>
-            <w:tcW w:type="dxa" w:w="2016"/>
-            <w:vAlign w:val="center"/>
-          </w:tcPr>
-          <w:p>
-            <w:r>
-              <w:rPr>
-                <w:sz w:val="15"/>
-              </w:rPr>
-              <w:t>$1,163,751.63</w:t>
-            </w:r>
-          </w:p>
-        </w:tc>
-      </w:tr>
-      <w:tr>
-        <w:tc>
-          <w:tcPr>
-            <w:tcW w:type="dxa" w:w="1152"/>
-            <w:vAlign w:val="center"/>
-          </w:tcPr>
-          <w:p>
-            <w:r>
-              <w:rPr>
-                <w:sz w:val="15"/>
-              </w:rPr>
-              <w:t>5100</w:t>
-            </w:r>
-          </w:p>
-        </w:tc>
-        <w:tc>
-          <w:tcPr>
-            <w:tcW w:type="dxa" w:w="4896"/>
-            <w:vAlign w:val="center"/>
-          </w:tcPr>
-          <w:p>
-            <w:r>
-              <w:rPr>
-                <w:sz w:val="15"/>
-              </w:rPr>
-              <w:t>Legal</w:t>
-            </w:r>
-          </w:p>
-        </w:tc>
-        <w:tc>
-          <w:tcPr>
-            <w:tcW w:type="dxa" w:w="1152"/>
-            <w:vAlign w:val="center"/>
-          </w:tcPr>
-          <w:p>
-            <w:r>
-              <w:rPr>
-                <w:sz w:val="15"/>
-              </w:rPr>
-              <w:t>153</w:t>
-            </w:r>
-          </w:p>
-        </w:tc>
-        <w:tc>
-          <w:tcPr>
-            <w:tcW w:type="dxa" w:w="2016"/>
-            <w:vAlign w:val="center"/>
-          </w:tcPr>
-          <w:p>
-            <w:r>
-              <w:rPr>
-                <w:sz w:val="15"/>
-              </w:rPr>
-              <w:t>$2,275,722.05</w:t>
-            </w:r>
-          </w:p>
-        </w:tc>
-      </w:tr>
-      <w:tr>
-        <w:tc>
-          <w:tcPr>
-            <w:tcW w:type="dxa" w:w="1152"/>
-            <w:vAlign w:val="center"/>
-          </w:tcPr>
-          <w:p>
-            <w:r>
-              <w:rPr>
-                <w:sz w:val="15"/>
-              </w:rPr>
-              <w:t>6200</w:t>
-            </w:r>
-          </w:p>
-        </w:tc>
-        <w:tc>
-          <w:tcPr>
-            <w:tcW w:type="dxa" w:w="4896"/>
-            <w:vAlign w:val="center"/>
-          </w:tcPr>
-          <w:p>
-            <w:r>
-              <w:rPr>
-                <w:sz w:val="15"/>
-              </w:rPr>
-              <w:t>People &amp; Workplace</w:t>
-            </w:r>
-          </w:p>
-        </w:tc>
-        <w:tc>
-          <w:tcPr>
-            <w:tcW w:type="dxa" w:w="1152"/>
-            <w:vAlign w:val="center"/>
-          </w:tcPr>
-          <w:p>
-            <w:r>
-              <w:rPr>
-                <w:sz w:val="15"/>
-              </w:rPr>
-              <w:t>142</w:t>
-            </w:r>
-          </w:p>
-        </w:tc>
-        <w:tc>
-          <w:tcPr>
-            <w:tcW w:type="dxa" w:w="2016"/>
-            <w:vAlign w:val="center"/>
-          </w:tcPr>
-          <w:p>
-            <w:r>
-              <w:rPr>
-                <w:sz w:val="15"/>
-              </w:rPr>
-              <w:t>$523,058.96</w:t>
-            </w:r>
-          </w:p>
-        </w:tc>
-      </w:tr>
-      <w:tr>
-        <w:tc>
-          <w:tcPr>
-            <w:tcW w:type="dxa" w:w="1152"/>
-            <w:vAlign w:val="center"/>
-          </w:tcPr>
-          <w:p>
-            <w:r>
-              <w:rPr>
-                <w:sz w:val="15"/>
-              </w:rPr>
-              <w:t>5200</w:t>
-            </w:r>
-          </w:p>
-        </w:tc>
-        <w:tc>
-          <w:tcPr>
-            <w:tcW w:type="dxa" w:w="4896"/>
-            <w:vAlign w:val="center"/>
-          </w:tcPr>
-          <w:p>
-            <w:r>
-              <w:rPr>
-                <w:sz w:val="15"/>
-              </w:rPr>
-              <w:t>Compliance &amp; Investigations</w:t>
-            </w:r>
-          </w:p>
-        </w:tc>
-        <w:tc>
-          <w:tcPr>
-            <w:tcW w:type="dxa" w:w="1152"/>
-            <w:vAlign w:val="center"/>
-          </w:tcPr>
-          <w:p>
-            <w:r>
-              <w:rPr>
-                <w:sz w:val="15"/>
-              </w:rPr>
-              <w:t>100</w:t>
-            </w:r>
-          </w:p>
-        </w:tc>
-        <w:tc>
-          <w:tcPr>
-            <w:tcW w:type="dxa" w:w="2016"/>
-            <w:vAlign w:val="center"/>
-          </w:tcPr>
-          <w:p>
-            <w:r>
-              <w:rPr>
-                <w:sz w:val="15"/>
-              </w:rPr>
-              <w:t>$574,801.62</w:t>
-            </w:r>
-          </w:p>
-        </w:tc>
-      </w:tr>
-      <w:tr>
-        <w:tc>
-          <w:tcPr>
-            <w:tcW w:type="dxa" w:w="1152"/>
-            <w:vAlign w:val="center"/>
-          </w:tcPr>
-          <w:p>
-            <w:r>
-              <w:rPr>
-                <w:sz w:val="15"/>
-              </w:rPr>
-              <w:t>6120</w:t>
-            </w:r>
-          </w:p>
-        </w:tc>
-        <w:tc>
-          <w:tcPr>
-            <w:tcW w:type="dxa" w:w="4896"/>
-            <w:vAlign w:val="center"/>
-          </w:tcPr>
-          <w:p>
-            <w:r>
-              <w:rPr>
-                <w:sz w:val="15"/>
-              </w:rPr>
-              <w:t>Transaction Operations</w:t>
-            </w:r>
-          </w:p>
-        </w:tc>
-        <w:tc>
-          <w:tcPr>
-            <w:tcW w:type="dxa" w:w="1152"/>
-            <w:vAlign w:val="center"/>
-          </w:tcPr>
-          <w:p>
-            <w:r>
-              <w:rPr>
-                <w:sz w:val="15"/>
-              </w:rPr>
-              <w:t>98</w:t>
-            </w:r>
-          </w:p>
-        </w:tc>
-        <w:tc>
-          <w:tcPr>
-            <w:tcW w:type="dxa" w:w="2016"/>
-            <w:vAlign w:val="center"/>
-          </w:tcPr>
-          <w:p>
-            <w:r>
-              <w:rPr>
-                <w:sz w:val="15"/>
-              </w:rPr>
-              <w:t>$370,862.96</w:t>
-            </w:r>
-          </w:p>
-        </w:tc>
-      </w:tr>
-      <w:tr>
-        <w:tc>
-          <w:tcPr>
-            <w:tcW w:type="dxa" w:w="1152"/>
-            <w:vAlign w:val="center"/>
-          </w:tcPr>
-          <w:p>
-            <w:r>
-              <w:rPr>
-                <w:sz w:val="15"/>
-              </w:rPr>
-              <w:t>7200</w:t>
-            </w:r>
-          </w:p>
-        </w:tc>
-        <w:tc>
-          <w:tcPr>
-            <w:tcW w:type="dxa" w:w="4896"/>
-            <w:vAlign w:val="center"/>
-          </w:tcPr>
-          <w:p>
-            <w:r>
-              <w:rPr>
-                <w:sz w:val="15"/>
-              </w:rPr>
-              <w:t>Communications</w:t>
-            </w:r>
-          </w:p>
-        </w:tc>
-        <w:tc>
-          <w:tcPr>
-            <w:tcW w:type="dxa" w:w="1152"/>
-            <w:vAlign w:val="center"/>
-          </w:tcPr>
-          <w:p>
-            <w:r>
-              <w:rPr>
-                <w:sz w:val="15"/>
-              </w:rPr>
-              <w:t>91</w:t>
-            </w:r>
-          </w:p>
-        </w:tc>
-        <w:tc>
-          <w:tcPr>
-            <w:tcW w:type="dxa" w:w="2016"/>
-            <w:vAlign w:val="center"/>
-          </w:tcPr>
-          <w:p>
-            <w:r>
-              <w:rPr>
-                <w:sz w:val="15"/>
-              </w:rPr>
-              <w:t>$521,704.51</w:t>
-            </w:r>
-          </w:p>
-        </w:tc>
-      </w:tr>
-      <w:tr>
-        <w:tc>
-          <w:tcPr>
-            <w:tcW w:type="dxa" w:w="1152"/>
-            <w:vAlign w:val="center"/>
-          </w:tcPr>
-          <w:p>
-            <w:r>
-              <w:rPr>
-                <w:sz w:val="15"/>
-              </w:rPr>
-              <w:t>3100</w:t>
-            </w:r>
-          </w:p>
-        </w:tc>
-        <w:tc>
-          <w:tcPr>
-            <w:tcW w:type="dxa" w:w="4896"/>
-            <w:vAlign w:val="center"/>
-          </w:tcPr>
-          <w:p>
-            <w:r>
-              <w:rPr>
-                <w:sz w:val="15"/>
-              </w:rPr>
-              <w:t>Seller Partnerships</w:t>
-            </w:r>
-          </w:p>
-        </w:tc>
-        <w:tc>
-          <w:tcPr>
-            <w:tcW w:type="dxa" w:w="1152"/>
-            <w:vAlign w:val="center"/>
-          </w:tcPr>
-          <w:p>
-            <w:r>
-              <w:rPr>
-                <w:sz w:val="15"/>
-              </w:rPr>
-              <w:t>83</w:t>
-            </w:r>
-          </w:p>
-        </w:tc>
-        <w:tc>
-          <w:tcPr>
-            <w:tcW w:type="dxa" w:w="2016"/>
-            <w:vAlign w:val="center"/>
-          </w:tcPr>
-          <w:p>
-            <w:r>
-              <w:rPr>
-                <w:sz w:val="15"/>
-              </w:rPr>
-              <w:t>$111,513.38</w:t>
-            </w:r>
-          </w:p>
-        </w:tc>
-      </w:tr>
-      <w:tr>
-        <w:tc>
-          <w:tcPr>
-            <w:tcW w:type="dxa" w:w="1152"/>
-            <w:vAlign w:val="center"/>
-          </w:tcPr>
-          <w:p>
-            <w:r>
-              <w:rPr>
-                <w:sz w:val="15"/>
-              </w:rPr>
-              <w:t>7100</w:t>
-            </w:r>
-          </w:p>
-        </w:tc>
-        <w:tc>
-          <w:tcPr>
-            <w:tcW w:type="dxa" w:w="4896"/>
-            <w:vAlign w:val="center"/>
-          </w:tcPr>
-          <w:p>
-            <w:r>
-              <w:rPr>
-                <w:sz w:val="15"/>
-              </w:rPr>
-              <w:t>Client Services</w:t>
-            </w:r>
-          </w:p>
-        </w:tc>
-        <w:tc>
-          <w:tcPr>
-            <w:tcW w:type="dxa" w:w="1152"/>
-            <w:vAlign w:val="center"/>
-          </w:tcPr>
-          <w:p>
-            <w:r>
-              <w:rPr>
-                <w:sz w:val="15"/>
-              </w:rPr>
-              <w:t>72</w:t>
-            </w:r>
-          </w:p>
-        </w:tc>
-        <w:tc>
-          <w:tcPr>
-            <w:tcW w:type="dxa" w:w="2016"/>
-            <w:vAlign w:val="center"/>
-          </w:tcPr>
-          <w:p>
-            <w:r>
-              <w:rPr>
-                <w:sz w:val="15"/>
-              </w:rPr>
-              <w:t>$179,643.07</w:t>
-            </w:r>
-          </w:p>
-        </w:tc>
-      </w:tr>
-      <w:tr>
-        <w:tc>
-          <w:tcPr>
-            <w:tcW w:type="dxa" w:w="1152"/>
-            <w:vAlign w:val="center"/>
-          </w:tcPr>
-          <w:p>
-            <w:r>
-              <w:rPr>
-                <w:sz w:val="15"/>
-              </w:rPr>
-              <w:t>4110</w:t>
-            </w:r>
-          </w:p>
-        </w:tc>
-        <w:tc>
-          <w:tcPr>
-            <w:tcW w:type="dxa" w:w="4896"/>
-            <w:vAlign w:val="center"/>
-          </w:tcPr>
-          <w:p>
-            <w:r>
-              <w:rPr>
-                <w:sz w:val="15"/>
-              </w:rPr>
-              <w:t>Provenance &amp; Cataloguing</w:t>
-            </w:r>
-          </w:p>
-        </w:tc>
-        <w:tc>
-          <w:tcPr>
-            <w:tcW w:type="dxa" w:w="1152"/>
-            <w:vAlign w:val="center"/>
-          </w:tcPr>
-          <w:p>
-            <w:r>
-              <w:rPr>
-                <w:sz w:val="15"/>
-              </w:rPr>
-              <w:t>66</w:t>
-            </w:r>
-          </w:p>
-        </w:tc>
-        <w:tc>
-          <w:tcPr>
-            <w:tcW w:type="dxa" w:w="2016"/>
-            <w:vAlign w:val="center"/>
-          </w:tcPr>
-          <w:p>
-            <w:r>
-              <w:rPr>
-                <w:sz w:val="15"/>
-              </w:rPr>
-              <w:t>$240,612.76</w:t>
-            </w:r>
-          </w:p>
-        </w:tc>
-      </w:tr>
-      <w:tr>
-        <w:tc>
-          <w:tcPr>
-            <w:tcW w:type="dxa" w:w="1152"/>
-            <w:vAlign w:val="center"/>
-          </w:tcPr>
-          <w:p>
-            <w:r>
-              <w:rPr>
-                <w:sz w:val="15"/>
-              </w:rPr>
-              <w:t>3200</w:t>
-            </w:r>
-          </w:p>
-        </w:tc>
-        <w:tc>
-          <w:tcPr>
-            <w:tcW w:type="dxa" w:w="4896"/>
-            <w:vAlign w:val="center"/>
-          </w:tcPr>
-          <w:p>
-            <w:r>
-              <w:rPr>
-                <w:sz w:val="15"/>
-              </w:rPr>
-              <w:t>Private Sales</w:t>
-            </w:r>
-          </w:p>
-        </w:tc>
-        <w:tc>
-          <w:tcPr>
-            <w:tcW w:type="dxa" w:w="1152"/>
-            <w:vAlign w:val="center"/>
-          </w:tcPr>
-          <w:p>
-            <w:r>
-              <w:rPr>
-                <w:sz w:val="15"/>
-              </w:rPr>
-              <w:t>51</w:t>
-            </w:r>
-          </w:p>
-        </w:tc>
-        <w:tc>
-          <w:tcPr>
-            <w:tcW w:type="dxa" w:w="2016"/>
-            <w:vAlign w:val="center"/>
-          </w:tcPr>
-          <w:p>
-            <w:r>
-              <w:rPr>
-                <w:sz w:val="15"/>
-              </w:rPr>
-              <w:t>$171,795.77</w:t>
-            </w:r>
-          </w:p>
-        </w:tc>
-      </w:tr>
-      <w:tr>
-        <w:tc>
-          <w:tcPr>
-            <w:tcW w:type="dxa" w:w="1152"/>
-            <w:vAlign w:val="center"/>
-          </w:tcPr>
-          <w:p>
-            <w:r>
-              <w:rPr>
-                <w:sz w:val="15"/>
-              </w:rPr>
-              <w:t>6110</w:t>
-            </w:r>
-          </w:p>
-        </w:tc>
-        <w:tc>
-          <w:tcPr>
-            <w:tcW w:type="dxa" w:w="4896"/>
-            <w:vAlign w:val="center"/>
-          </w:tcPr>
-          <w:p>
-            <w:r>
-              <w:rPr>
-                <w:sz w:val="15"/>
-              </w:rPr>
-              <w:t>Accounting &amp; Treasury</w:t>
-            </w:r>
-          </w:p>
-        </w:tc>
-        <w:tc>
-          <w:tcPr>
-            <w:tcW w:type="dxa" w:w="1152"/>
-            <w:vAlign w:val="center"/>
-          </w:tcPr>
-          <w:p>
-            <w:r>
-              <w:rPr>
-                <w:sz w:val="15"/>
-              </w:rPr>
-              <w:t>49</w:t>
-            </w:r>
-          </w:p>
-        </w:tc>
-        <w:tc>
-          <w:tcPr>
-            <w:tcW w:type="dxa" w:w="2016"/>
-            <w:vAlign w:val="center"/>
-          </w:tcPr>
-          <w:p>
-            <w:r>
-              <w:rPr>
-                <w:sz w:val="15"/>
-              </w:rPr>
-              <w:t>$118,238.66</w:t>
-            </w:r>
-          </w:p>
-        </w:tc>
-      </w:tr>
-      <w:tr>
-        <w:tc>
-          <w:tcPr>
-            <w:tcW w:type="dxa" w:w="1152"/>
-            <w:vAlign w:val="center"/>
-          </w:tcPr>
-          <w:p>
-            <w:r>
-              <w:rPr>
-                <w:sz w:val="15"/>
-              </w:rPr>
-              <w:t>2200</w:t>
-            </w:r>
-          </w:p>
-        </w:tc>
-        <w:tc>
-          <w:tcPr>
-            <w:tcW w:type="dxa" w:w="4896"/>
-            <w:vAlign w:val="center"/>
-          </w:tcPr>
-          <w:p>
-            <w:r>
-              <w:rPr>
-                <w:sz w:val="15"/>
-              </w:rPr>
-              <w:t>Data &amp; Business Systems</w:t>
-            </w:r>
-          </w:p>
-        </w:tc>
-        <w:tc>
-          <w:tcPr>
-            <w:tcW w:type="dxa" w:w="1152"/>
-            <w:vAlign w:val="center"/>
-          </w:tcPr>
-          <w:p>
-            <w:r>
-              <w:rPr>
-                <w:sz w:val="15"/>
-              </w:rPr>
-              <w:t>37</w:t>
-            </w:r>
-          </w:p>
-        </w:tc>
-        <w:tc>
-          <w:tcPr>
-            <w:tcW w:type="dxa" w:w="2016"/>
-            <w:vAlign w:val="center"/>
-          </w:tcPr>
-          <w:p>
-            <w:r>
-              <w:rPr>
-                <w:sz w:val="15"/>
-              </w:rPr>
-              <w:t>$167,390.36</w:t>
-            </w:r>
-          </w:p>
-        </w:tc>
-      </w:tr>
-      <w:tr>
-        <w:tc>
-          <w:tcPr>
-            <w:tcW w:type="dxa" w:w="1152"/>
-            <w:vAlign w:val="center"/>
-          </w:tcPr>
-          <w:p>
-            <w:r>
-              <w:rPr>
-                <w:sz w:val="15"/>
-              </w:rPr>
-              <w:t>4120</w:t>
-            </w:r>
-          </w:p>
-        </w:tc>
-        <w:tc>
-          <w:tcPr>
-            <w:tcW w:type="dxa" w:w="4896"/>
-            <w:vAlign w:val="center"/>
-          </w:tcPr>
-          <w:p>
-            <w:r>
-              <w:rPr>
-                <w:sz w:val="15"/>
-              </w:rPr>
-              <w:t>Valuation &amp; Condition</w:t>
-            </w:r>
-          </w:p>
-        </w:tc>
-        <w:tc>
-          <w:tcPr>
-            <w:tcW w:type="dxa" w:w="1152"/>
-            <w:vAlign w:val="center"/>
-          </w:tcPr>
-          <w:p>
-            <w:r>
-              <w:rPr>
-                <w:sz w:val="15"/>
-              </w:rPr>
-              <w:t>30</w:t>
-            </w:r>
-          </w:p>
-        </w:tc>
-        <w:tc>
-          <w:tcPr>
-            <w:tcW w:type="dxa" w:w="2016"/>
-            <w:vAlign w:val="center"/>
-          </w:tcPr>
-          <w:p>
-            <w:r>
-              <w:rPr>
-                <w:sz w:val="15"/>
-              </w:rPr>
-              <w:t>$76,081.12</w:t>
-            </w:r>
-          </w:p>
-        </w:tc>
-      </w:tr>
-      <w:tr>
-        <w:tc>
-          <w:tcPr>
-            <w:tcW w:type="dxa" w:w="1152"/>
-            <w:vAlign w:val="center"/>
-          </w:tcPr>
-          <w:p>
-            <w:r>
-              <w:rPr>
-                <w:sz w:val="15"/>
-              </w:rPr>
-              <w:t>2300</w:t>
-            </w:r>
-          </w:p>
-        </w:tc>
-        <w:tc>
-          <w:tcPr>
-            <w:tcW w:type="dxa" w:w="4896"/>
-            <w:vAlign w:val="center"/>
-          </w:tcPr>
-          <w:p>
-            <w:r>
-              <w:rPr>
-                <w:sz w:val="15"/>
-              </w:rPr>
-              <w:t>IT &amp; Security</w:t>
-            </w:r>
-          </w:p>
-        </w:tc>
-        <w:tc>
-          <w:tcPr>
-            <w:tcW w:type="dxa" w:w="1152"/>
-            <w:vAlign w:val="center"/>
-          </w:tcPr>
-          <w:p>
-            <w:r>
-              <w:rPr>
-                <w:sz w:val="15"/>
-              </w:rPr>
-              <w:t>25</w:t>
-            </w:r>
-          </w:p>
-        </w:tc>
-        <w:tc>
-          <w:tcPr>
-            <w:tcW w:type="dxa" w:w="2016"/>
-            <w:vAlign w:val="center"/>
-          </w:tcPr>
-          <w:p>
-            <w:r>
-              <w:rPr>
-                <w:sz w:val="15"/>
-              </w:rPr>
-              <w:t>$112,618.40</w:t>
-            </w:r>
-          </w:p>
-        </w:tc>
-      </w:tr>
-      <w:tr>
-        <w:tc>
-          <w:tcPr>
-            <w:tcW w:type="dxa" w:w="1152"/>
-            <w:vAlign w:val="center"/>
-          </w:tcPr>
-          <w:p>
-            <w:r>
-              <w:rPr>
-                <w:sz w:val="15"/>
-              </w:rPr>
-              <w:t>1200</w:t>
-            </w:r>
-          </w:p>
-        </w:tc>
-        <w:tc>
-          <w:tcPr>
-            <w:tcW w:type="dxa" w:w="4896"/>
-            <w:vAlign w:val="center"/>
-          </w:tcPr>
-          <w:p>
-            <w:r>
-              <w:rPr>
-                <w:sz w:val="15"/>
-              </w:rPr>
-              <w:t>Strategy &amp; Corporate Affairs</w:t>
-            </w:r>
-          </w:p>
-        </w:tc>
-        <w:tc>
-          <w:tcPr>
-            <w:tcW w:type="dxa" w:w="1152"/>
-            <w:vAlign w:val="center"/>
-          </w:tcPr>
-          <w:p>
-            <w:r>
-              <w:rPr>
-                <w:sz w:val="15"/>
-              </w:rPr>
-              <w:t>5</w:t>
-            </w:r>
-          </w:p>
-        </w:tc>
-        <w:tc>
-          <w:tcPr>
-            <w:tcW w:type="dxa" w:w="2016"/>
-            <w:vAlign w:val="center"/>
-          </w:tcPr>
-          <w:p>
-            <w:r>
-              <w:rPr>
-                <w:sz w:val="15"/>
-              </w:rPr>
-              <w:t>$46,885.12</w:t>
-            </w:r>
-          </w:p>
-        </w:tc>
-      </w:tr>
-      <w:tr>
-        <w:tc>
-          <w:tcPr>
-            <w:tcW w:type="dxa" w:w="1152"/>
-            <w:vAlign w:val="center"/>
-          </w:tcPr>
-          <w:p>
-            <w:r>
-              <w:rPr>
-                <w:sz w:val="15"/>
-              </w:rPr>
-              <w:t>1100</w:t>
-            </w:r>
-          </w:p>
-        </w:tc>
-        <w:tc>
-          <w:tcPr>
-            <w:tcW w:type="dxa" w:w="4896"/>
-            <w:vAlign w:val="center"/>
-          </w:tcPr>
-          <w:p>
-            <w:r>
-              <w:rPr>
-                <w:sz w:val="15"/>
-              </w:rPr>
-              <w:t>Executive Office</w:t>
-            </w:r>
-          </w:p>
-        </w:tc>
-        <w:tc>
-          <w:tcPr>
-            <w:tcW w:type="dxa" w:w="1152"/>
-            <w:vAlign w:val="center"/>
-          </w:tcPr>
-          <w:p>
-            <w:r>
-              <w:rPr>
-                <w:sz w:val="15"/>
-              </w:rPr>
-              <w:t>4</w:t>
-            </w:r>
-          </w:p>
-        </w:tc>
-        <w:tc>
-          <w:tcPr>
-            <w:tcW w:type="dxa" w:w="2016"/>
-            <w:vAlign w:val="center"/>
-          </w:tcPr>
-          <w:p>
-            <w:r>
-              <w:rPr>
-                <w:sz w:val="15"/>
-              </w:rPr>
-              <w:t>$4,013.40</w:t>
-            </w:r>
-          </w:p>
-        </w:tc>
-      </w:tr>
-    </w:tbl>
-    <w:p>
-      <w:pPr>
-        <w:pStyle w:val="Heading1"/>
-      </w:pPr>
-      <w:r>
-        <w:t>9. Data-generation characteristics</w:t>
-      </w:r>
-    </w:p>
-    <w:p>
-      <w:pPr>
-        <w:pStyle w:val="ListBullet"/>
-      </w:pPr>
-      <w:r>
-        <w:t>Amounts are right-skewed: many small operational purchases, fewer medium vendor invoices, and rare large professional-service bills.</w:t>
-      </w:r>
-    </w:p>
-    <w:p>
-      <w:pPr>
-        <w:pStyle w:val="ListBullet"/>
-      </w:pPr>
-      <w:r>
-        <w:t>Recurring expenses use repeated but imperfect descriptions and amounts rather than identical monthly clones.</w:t>
-      </w:r>
-    </w:p>
-    <w:p>
-      <w:pPr>
-        <w:pStyle w:val="ListBullet"/>
-      </w:pPr>
-      <w:r>
-        <w:t>Most rows are ordinary non-event business traffic; story events influence the local mix and intensity rather than dictating each record.</w:t>
-      </w:r>
-    </w:p>
-    <w:p>
-      <w:pPr>
-        <w:pStyle w:val="ListBullet"/>
-      </w:pPr>
-      <w:r>
-        <w:t>Expense IDs are stable ledger identifiers and are not intended to encode date or phase.</w:t>
-      </w:r>
-    </w:p>
-    <w:p>
-      <w:pPr>
-        <w:pStyle w:val="ListBullet"/>
-      </w:pPr>
-      <w:r>
-        <w:t>sqlvalley_expenses.csv contains only the canonical seven schema fields.</w:t>
-      </w:r>
-    </w:p>
-    <w:p>
-      <w:pPr>
-        <w:pStyle w:val="ListBullet"/>
-      </w:pPr>
-      <w:r>
-        <w:t>sqlvalley_expenses_with_helpers.csv contains the same rows plus navigation-only helper fields; these are not part of the SQL schema.</w:t>
-      </w:r>
-    </w:p>
-    <w:p>
-      <w:pPr>
-        <w:pStyle w:val="ListBullet"/>
-      </w:pPr>
-      <w:r>
-        <w:t>No exercise-specific fraud, tampering, duplicate-invoice scheme, threshold gaming, or deliberately suspicious approval pattern is seeded in this baseline.</w:t>
-      </w:r>
-    </w:p>
-    <w:p>
-      <w:pPr>
-        <w:pStyle w:val="ListBullet"/>
-      </w:pPr>
-      <w:r>
-        <w:t>NULL is written literally as NULL to match the conventions used in the other SQLValley CSV datasets.</w:t>
-      </w:r>
-    </w:p>
-    <w:p>
-      <w:pPr>
-        <w:pStyle w:val="Heading1"/>
-      </w:pPr>
-      <w:r>
-        <w:t>10. Useful SQL exercise patterns</w:t>
+        <w:t>10. Files</w:t>
       </w:r>
     </w:p>
     <w:p>
       <w:r>
-        <w:t>The baseline supports beginner and intermediate exercises involving SUM/AVG/COUNT, GROUP BY, date filtering, joins to departments and employees, top spenders/approvers, monthly trends, recurring descriptions, and pre/post-crisis or pre/post-pivot comparisons. Deliberate exercise-answer rows and anomaly scenarios are intentionally excluded and can be layered on later.</w:t>
+        <w:t>sqlvalley_expenses.csv — canonical schema only</w:t>
       </w:r>
     </w:p>
     <w:p>
-      <w:pPr>
-        <w:pStyle w:val="Heading1"/>
-      </w:pPr>
       <w:r>
-        <w:t>11. Validation summary</w:t>
+        <w:t>sqlvalley_expenses_with_helpers.csv — same rows plus navigation helpers</w:t>
       </w:r>
     </w:p>
-    <w:tbl>
-      <w:tblPr>
-        <w:tblStyle w:val="TableGrid"/>
-        <w:tblW w:type="auto" w:w="0"/>
-        <w:jc w:val="center"/>
-        <w:tblLook w:firstColumn="1" w:firstRow="1" w:lastColumn="0" w:lastRow="0" w:noHBand="0" w:noVBand="1" w:val="04A0"/>
-      </w:tblPr>
-      <w:tblGrid>
-        <w:gridCol w:w="5184"/>
-        <w:gridCol w:w="5184"/>
-      </w:tblGrid>
-      <w:tr>
-        <w:trPr>
-          <w:tblHeader w:val="true"/>
-        </w:trPr>
-        <w:tc>
-          <w:tcPr>
-            <w:tcW w:type="dxa" w:w="5040"/>
-            <w:shd w:fill="D9EAF7"/>
-          </w:tcPr>
-          <w:p>
-            <w:r>
-              <w:rPr>
-                <w:b/>
-                <w:sz w:val="16"/>
-              </w:rPr>
-              <w:t>Check</w:t>
-            </w:r>
-          </w:p>
-        </w:tc>
-        <w:tc>
-          <w:tcPr>
-            <w:tcW w:type="dxa" w:w="4320"/>
-            <w:shd w:fill="D9EAF7"/>
-          </w:tcPr>
-          <w:p>
-            <w:r>
-              <w:rPr>
-                <w:b/>
-                <w:sz w:val="16"/>
-              </w:rPr>
-              <w:t>Result</w:t>
-            </w:r>
-          </w:p>
-        </w:tc>
-      </w:tr>
-      <w:tr>
-        <w:tc>
-          <w:tcPr>
-            <w:tcW w:type="dxa" w:w="5040"/>
-            <w:vAlign w:val="center"/>
-          </w:tcPr>
-          <w:p>
-            <w:r>
-              <w:rPr>
-                <w:sz w:val="16"/>
-              </w:rPr>
-              <w:t>Row count</w:t>
-            </w:r>
-          </w:p>
-        </w:tc>
-        <w:tc>
-          <w:tcPr>
-            <w:tcW w:type="dxa" w:w="4320"/>
-            <w:vAlign w:val="center"/>
-          </w:tcPr>
-          <w:p>
-            <w:r>
-              <w:rPr>
-                <w:sz w:val="16"/>
-              </w:rPr>
-              <w:t>PASS - 1,450</w:t>
-            </w:r>
-          </w:p>
-        </w:tc>
-      </w:tr>
-      <w:tr>
-        <w:tc>
-          <w:tcPr>
-            <w:tcW w:type="dxa" w:w="5040"/>
-            <w:vAlign w:val="center"/>
-          </w:tcPr>
-          <w:p>
-            <w:r>
-              <w:rPr>
-                <w:sz w:val="16"/>
-              </w:rPr>
-              <w:t>Unique exp_id</w:t>
-            </w:r>
-          </w:p>
-        </w:tc>
-        <w:tc>
-          <w:tcPr>
-            <w:tcW w:type="dxa" w:w="4320"/>
-            <w:vAlign w:val="center"/>
-          </w:tcPr>
-          <w:p>
-            <w:r>
-              <w:rPr>
-                <w:sz w:val="16"/>
-              </w:rPr>
-              <w:t>PASS</w:t>
-            </w:r>
-          </w:p>
-        </w:tc>
-      </w:tr>
-      <w:tr>
-        <w:tc>
-          <w:tcPr>
-            <w:tcW w:type="dxa" w:w="5040"/>
-            <w:vAlign w:val="center"/>
-          </w:tcPr>
-          <w:p>
-            <w:r>
-              <w:rPr>
-                <w:sz w:val="16"/>
-              </w:rPr>
-              <w:t>Valid department FKs</w:t>
-            </w:r>
-          </w:p>
-        </w:tc>
-        <w:tc>
-          <w:tcPr>
-            <w:tcW w:type="dxa" w:w="4320"/>
-            <w:vAlign w:val="center"/>
-          </w:tcPr>
-          <w:p>
-            <w:r>
-              <w:rPr>
-                <w:sz w:val="16"/>
-              </w:rPr>
-              <w:t>PASS</w:t>
-            </w:r>
-          </w:p>
-        </w:tc>
-      </w:tr>
-      <w:tr>
-        <w:tc>
-          <w:tcPr>
-            <w:tcW w:type="dxa" w:w="5040"/>
-            <w:vAlign w:val="center"/>
-          </w:tcPr>
-          <w:p>
-            <w:r>
-              <w:rPr>
-                <w:sz w:val="16"/>
-              </w:rPr>
-              <w:t>Valid employee FKs</w:t>
-            </w:r>
-          </w:p>
-        </w:tc>
-        <w:tc>
-          <w:tcPr>
-            <w:tcW w:type="dxa" w:w="4320"/>
-            <w:vAlign w:val="center"/>
-          </w:tcPr>
-          <w:p>
-            <w:r>
-              <w:rPr>
-                <w:sz w:val="16"/>
-              </w:rPr>
-              <w:t>PASS</w:t>
-            </w:r>
-          </w:p>
-        </w:tc>
-      </w:tr>
-      <w:tr>
-        <w:tc>
-          <w:tcPr>
-            <w:tcW w:type="dxa" w:w="5040"/>
-            <w:vAlign w:val="center"/>
-          </w:tcPr>
-          <w:p>
-            <w:r>
-              <w:rPr>
-                <w:sz w:val="16"/>
-              </w:rPr>
-              <w:t>Employee date/availability validity</w:t>
-            </w:r>
-          </w:p>
-        </w:tc>
-        <w:tc>
-          <w:tcPr>
-            <w:tcW w:type="dxa" w:w="4320"/>
-            <w:vAlign w:val="center"/>
-          </w:tcPr>
-          <w:p>
-            <w:r>
-              <w:rPr>
-                <w:sz w:val="16"/>
-              </w:rPr>
-              <w:t>PASS</w:t>
-            </w:r>
-          </w:p>
-        </w:tc>
-      </w:tr>
-      <w:tr>
-        <w:tc>
-          <w:tcPr>
-            <w:tcW w:type="dxa" w:w="5040"/>
-            <w:vAlign w:val="center"/>
-          </w:tcPr>
-          <w:p>
-            <w:r>
-              <w:rPr>
-                <w:sz w:val="16"/>
-              </w:rPr>
-              <w:t>Phase 1 employee references</w:t>
-            </w:r>
-          </w:p>
-        </w:tc>
-        <w:tc>
-          <w:tcPr>
-            <w:tcW w:type="dxa" w:w="4320"/>
-            <w:vAlign w:val="center"/>
-          </w:tcPr>
-          <w:p>
-            <w:r>
-              <w:rPr>
-                <w:sz w:val="16"/>
-              </w:rPr>
-              <w:t>PASS - all NULL</w:t>
-            </w:r>
-          </w:p>
-        </w:tc>
-      </w:tr>
-      <w:tr>
-        <w:tc>
-          <w:tcPr>
-            <w:tcW w:type="dxa" w:w="5040"/>
-            <w:vAlign w:val="center"/>
-          </w:tcPr>
-          <w:p>
-            <w:r>
-              <w:rPr>
-                <w:sz w:val="16"/>
-              </w:rPr>
-              <w:t>Positive amounts</w:t>
-            </w:r>
-          </w:p>
-        </w:tc>
-        <w:tc>
-          <w:tcPr>
-            <w:tcW w:type="dxa" w:w="4320"/>
-            <w:vAlign w:val="center"/>
-          </w:tcPr>
-          <w:p>
-            <w:r>
-              <w:rPr>
-                <w:sz w:val="16"/>
-              </w:rPr>
-              <w:t>PASS</w:t>
-            </w:r>
-          </w:p>
-        </w:tc>
-      </w:tr>
-      <w:tr>
-        <w:tc>
-          <w:tcPr>
-            <w:tcW w:type="dxa" w:w="5040"/>
-            <w:vAlign w:val="center"/>
-          </w:tcPr>
-          <w:p>
-            <w:r>
-              <w:rPr>
-                <w:sz w:val="16"/>
-              </w:rPr>
-              <w:t>Marcelle used after sabbatical start</w:t>
-            </w:r>
-          </w:p>
-        </w:tc>
-        <w:tc>
-          <w:tcPr>
-            <w:tcW w:type="dxa" w:w="4320"/>
-            <w:vAlign w:val="center"/>
-          </w:tcPr>
-          <w:p>
-            <w:r>
-              <w:rPr>
-                <w:sz w:val="16"/>
-              </w:rPr>
-              <w:t>PASS - 0 rows</w:t>
-            </w:r>
-          </w:p>
-        </w:tc>
-      </w:tr>
-      <w:tr>
-        <w:tc>
-          <w:tcPr>
-            <w:tcW w:type="dxa" w:w="5040"/>
-            <w:vAlign w:val="center"/>
-          </w:tcPr>
-          <w:p>
-            <w:r>
-              <w:rPr>
-                <w:sz w:val="16"/>
-              </w:rPr>
-              <w:t>Self-approved expenses</w:t>
-            </w:r>
-          </w:p>
-        </w:tc>
-        <w:tc>
-          <w:tcPr>
-            <w:tcW w:type="dxa" w:w="4320"/>
-            <w:vAlign w:val="center"/>
-          </w:tcPr>
-          <w:p>
-            <w:r>
-              <w:rPr>
-                <w:sz w:val="16"/>
-              </w:rPr>
-              <w:t>PASS - 0 rows</w:t>
-            </w:r>
-          </w:p>
-        </w:tc>
-      </w:tr>
-      <w:tr>
-        <w:tc>
-          <w:tcPr>
-            <w:tcW w:type="dxa" w:w="5040"/>
-            <w:vAlign w:val="center"/>
-          </w:tcPr>
-          <w:p>
-            <w:r>
-              <w:rPr>
-                <w:sz w:val="16"/>
-              </w:rPr>
-              <w:t>Exercise-specific seeded rows</w:t>
-            </w:r>
-          </w:p>
-        </w:tc>
-        <w:tc>
-          <w:tcPr>
-            <w:tcW w:type="dxa" w:w="4320"/>
-            <w:vAlign w:val="center"/>
-          </w:tcPr>
-          <w:p>
-            <w:r>
-              <w:rPr>
-                <w:sz w:val="16"/>
-              </w:rPr>
-              <w:t>PASS - 0</w:t>
-            </w:r>
-          </w:p>
-        </w:tc>
-      </w:tr>
-      <w:tr>
-        <w:tc>
-          <w:tcPr>
-            <w:tcW w:type="dxa" w:w="5040"/>
-            <w:vAlign w:val="center"/>
-          </w:tcPr>
-          <w:p>
-            <w:r>
-              <w:rPr>
-                <w:sz w:val="16"/>
-              </w:rPr>
-              <w:t>NULL requesters</w:t>
-            </w:r>
-          </w:p>
-        </w:tc>
-        <w:tc>
-          <w:tcPr>
-            <w:tcW w:type="dxa" w:w="4320"/>
-            <w:vAlign w:val="center"/>
-          </w:tcPr>
-          <w:p>
-            <w:r>
-              <w:rPr>
-                <w:sz w:val="16"/>
-              </w:rPr>
-              <w:t>121</w:t>
-            </w:r>
-          </w:p>
-        </w:tc>
-      </w:tr>
-      <w:tr>
-        <w:tc>
-          <w:tcPr>
-            <w:tcW w:type="dxa" w:w="5040"/>
-            <w:vAlign w:val="center"/>
-          </w:tcPr>
-          <w:p>
-            <w:r>
-              <w:rPr>
-                <w:sz w:val="16"/>
-              </w:rPr>
-              <w:t>NULL approvers</w:t>
-            </w:r>
-          </w:p>
-        </w:tc>
-        <w:tc>
-          <w:tcPr>
-            <w:tcW w:type="dxa" w:w="4320"/>
-            <w:vAlign w:val="center"/>
-          </w:tcPr>
-          <w:p>
-            <w:r>
-              <w:rPr>
-                <w:sz w:val="16"/>
-              </w:rPr>
-              <w:t>147</w:t>
-            </w:r>
-          </w:p>
-        </w:tc>
-      </w:tr>
-    </w:tbl>
+    <w:p>
+      <w:r>
+        <w:t>SQLValley_Expenses_README.docx — this document</w:t>
+      </w:r>
+    </w:p>
     <w:sectPr>
-      <w:footerReference w:type="default" r:id="rId9"/>
+      <w:headerReference w:type="default" r:id="rId9"/>
+      <w:footerReference w:type="default" r:id="rId10"/>
       <w:pgSz w:w="12240" w:h="15840"/>
-      <w:pgMar w:top="792" w:right="936" w:bottom="792" w:left="936" w:header="720" w:footer="720" w:gutter="0"/>
+      <w:pgMar w:top="749" w:right="936" w:bottom="749" w:left="936" w:header="720" w:footer="720" w:gutter="0"/>
       <w:cols w:space="720"/>
       <w:docGrid w:linePitch="360"/>
     </w:sectPr>
@@ -2718,16 +1601,32 @@
   <w:p>
     <w:pPr>
       <w:pStyle w:val="Footer"/>
-      <w:jc w:val="center"/>
+      <w:jc w:val="right"/>
     </w:pPr>
     <w:r>
       <w:rPr>
         <w:sz w:val="16"/>
       </w:rPr>
-      <w:t>SQLValley / HeriShare - Expenses dataset</w:t>
+      <w:t>Historically aligned baseline</w:t>
     </w:r>
   </w:p>
 </w:ftr>
+</file>
+
+<file path=word/header1.xml><?xml version="1.0" encoding="utf-8"?>
+<w:hdr xmlns:m="http://schemas.openxmlformats.org/officeDocument/2006/math" xmlns:mc="http://schemas.openxmlformats.org/markup-compatibility/2006" xmlns:mo="http://schemas.microsoft.com/office/mac/office/2008/main" xmlns:mv="urn:schemas-microsoft-com:mac:vml" xmlns:o="urn:schemas-microsoft-com:office:office" xmlns:r="http://schemas.openxmlformats.org/officeDocument/2006/relationships" xmlns:v="urn:schemas-microsoft-com:vml" xmlns:w10="urn:schemas-microsoft-com:office:word" xmlns:w14="http://schemas.microsoft.com/office/word/2010/wordml" xmlns:w="http://schemas.openxmlformats.org/wordprocessingml/2006/main" xmlns:wne="http://schemas.microsoft.com/office/word/2006/wordml" xmlns:wp14="http://schemas.microsoft.com/office/word/2010/wordprocessingDrawing" xmlns:wp="http://schemas.openxmlformats.org/drawingml/2006/wordprocessingDrawing" xmlns:wpc="http://schemas.microsoft.com/office/word/2010/wordprocessingCanvas" xmlns:wpg="http://schemas.microsoft.com/office/word/2010/wordprocessingGroup" xmlns:wpi="http://schemas.microsoft.com/office/word/2010/wordprocessingInk" xmlns:wps="http://schemas.microsoft.com/office/word/2010/wordprocessingShape" mc:Ignorable="w14 wp14">
+  <w:p>
+    <w:pPr>
+      <w:pStyle w:val="Header"/>
+    </w:pPr>
+    <w:r>
+      <w:rPr>
+        <w:sz w:val="16"/>
+      </w:rPr>
+      <w:t>SQLValley • Expenses</w:t>
+    </w:r>
+  </w:p>
+</w:hdr>
 </file>
 
 <file path=word/numbering.xml><?xml version="1.0" encoding="utf-8"?>
@@ -3094,11 +1993,11 @@
     <w:qFormat/>
     <w:rsid w:val="00FC693F"/>
     <w:pPr>
-      <w:spacing w:after="60"/>
+      <w:spacing w:after="56" w:line="247" w:lineRule="auto"/>
     </w:pPr>
     <w:rPr>
       <w:rFonts w:ascii="Aptos" w:hAnsi="Aptos"/>
-      <w:sz w:val="19"/>
+      <w:sz w:val="17"/>
     </w:rPr>
   </w:style>
   <w:style w:type="paragraph" w:styleId="Header">
@@ -3156,15 +2055,15 @@
     <w:pPr>
       <w:keepNext/>
       <w:keepLines/>
-      <w:spacing w:before="480" w:after="0"/>
+      <w:spacing w:before="100" w:after="40"/>
       <w:outlineLvl w:val="0"/>
     </w:pPr>
     <w:rPr>
-      <w:rFonts w:asciiTheme="majorHAnsi" w:eastAsiaTheme="majorEastAsia" w:hAnsiTheme="majorHAnsi" w:cstheme="majorBidi" w:ascii="Aptos" w:hAnsi="Aptos"/>
+      <w:rFonts w:asciiTheme="majorHAnsi" w:eastAsiaTheme="majorEastAsia" w:hAnsiTheme="majorHAnsi" w:cstheme="majorBidi" w:ascii="Aptos Display" w:hAnsi="Aptos Display"/>
       <w:b/>
       <w:bCs/>
-      <w:color w:val="1F4E78"/>
-      <w:sz w:val="30"/>
+      <w:color w:val="365F91" w:themeColor="accent1" w:themeShade="BF"/>
+      <w:sz w:val="26"/>
       <w:szCs w:val="28"/>
     </w:rPr>
   </w:style>
@@ -3184,11 +2083,11 @@
       <w:outlineLvl w:val="1"/>
     </w:pPr>
     <w:rPr>
-      <w:rFonts w:asciiTheme="majorHAnsi" w:eastAsiaTheme="majorEastAsia" w:hAnsiTheme="majorHAnsi" w:cstheme="majorBidi" w:ascii="Aptos" w:hAnsi="Aptos"/>
+      <w:rFonts w:asciiTheme="majorHAnsi" w:eastAsiaTheme="majorEastAsia" w:hAnsiTheme="majorHAnsi" w:cstheme="majorBidi" w:ascii="Aptos Display" w:hAnsi="Aptos Display"/>
       <w:b/>
       <w:bCs/>
-      <w:color w:val="2F5597"/>
-      <w:sz w:val="23"/>
+      <w:color w:val="4F81BD" w:themeColor="accent1"/>
+      <w:sz w:val="22"/>
       <w:szCs w:val="26"/>
     </w:rPr>
   </w:style>
@@ -3450,7 +2349,8 @@
     </w:pPr>
     <w:rPr>
       <w:rFonts w:asciiTheme="majorHAnsi" w:eastAsiaTheme="majorEastAsia" w:hAnsiTheme="majorHAnsi" w:cstheme="majorBidi" w:ascii="Aptos Display" w:hAnsi="Aptos Display"/>
-      <w:color w:val="1F4E78"/>
+      <w:b/>
+      <w:color w:val="17365D" w:themeColor="text2" w:themeShade="BF"/>
       <w:spacing w:val="5"/>
       <w:kern w:val="28"/>
       <w:sz w:val="44"/>

</xml_diff>